<commit_message>
Fix tính năng backup
</commit_message>
<xml_diff>
--- a/Docs/BaoCao.docx
+++ b/Docs/BaoCao.docx
@@ -71,7 +71,6 @@
         </w:rPr>
       </w:pPr>
       <w:bookmarkStart w:id="0" w:name="_Toc225615460"/>
-      <w:bookmarkStart w:id="1" w:name="_Toc225618031"/>
       <w:r>
         <w:rPr>
           <w:b/>
@@ -168,7 +167,6 @@
         <w:t xml:space="preserve"> TẠO</w:t>
       </w:r>
       <w:bookmarkEnd w:id="0"/>
-      <w:bookmarkEnd w:id="1"/>
     </w:p>
     <w:p>
       <w:pPr>
@@ -839,7 +837,27 @@
           <w:szCs w:val="28"/>
           <w:lang w:val="en-US"/>
         </w:rPr>
-        <w:t xml:space="preserve"> Tháng 3 Năm 2026</w:t>
+        <w:t xml:space="preserve"> Tháng </w:t>
+      </w:r>
+      <w:r>
+        <w:rPr>
+          <w:b/>
+          <w:bCs/>
+          <w:sz w:val="28"/>
+          <w:szCs w:val="28"/>
+          <w:lang w:val="en-US"/>
+        </w:rPr>
+        <w:t>4</w:t>
+      </w:r>
+      <w:r>
+        <w:rPr>
+          <w:b/>
+          <w:bCs/>
+          <w:sz w:val="28"/>
+          <w:szCs w:val="28"/>
+          <w:lang w:val="en-US"/>
+        </w:rPr>
+        <w:t xml:space="preserve"> Năm 2026</w:t>
       </w:r>
     </w:p>
     <w:p>
@@ -1441,7 +1459,8 @@
           <w:bCs/>
         </w:rPr>
       </w:pPr>
-      <w:bookmarkStart w:id="2" w:name="_Toc225618032"/>
+      <w:bookmarkStart w:id="1" w:name="_Toc225618032"/>
+      <w:bookmarkStart w:id="2" w:name="_Toc226222060"/>
       <w:r>
         <w:rPr>
           <w:rFonts w:cs="Times New Roman"/>
@@ -1486,6 +1505,7 @@
         </w:rPr>
         <w:t>ƠN</w:t>
       </w:r>
+      <w:bookmarkEnd w:id="1"/>
       <w:bookmarkEnd w:id="2"/>
     </w:p>
     <w:p>
@@ -2598,41 +2618,6 @@
     </w:p>
     <w:p>
       <w:pPr>
-        <w:pStyle w:val="Mucluc2"/>
-        <w:tabs>
-          <w:tab w:val="right" w:leader="dot" w:pos="9395"/>
-        </w:tabs>
-        <w:rPr>
-          <w:rFonts w:cstheme="minorBidi"/>
-          <w:noProof/>
-          <w:kern w:val="2"/>
-          <w:sz w:val="24"/>
-          <w:szCs w:val="24"/>
-          <w14:ligatures w14:val="standardContextual"/>
-        </w:rPr>
-      </w:pPr>
-      <w:hyperlink w:anchor="_Toc225618031" w:history="1"/>
-    </w:p>
-    <w:p>
-      <w:pPr>
-        <w:pStyle w:val="Mucluc1"/>
-        <w:rPr>
-          <w:kern w:val="2"/>
-          <w14:ligatures w14:val="standardContextual"/>
-        </w:rPr>
-      </w:pPr>
-      <w:r>
-        <w:rPr>
-          <w:rStyle w:val="Siuktni"/>
-          <w:b/>
-          <w:bCs/>
-          <w:color w:val="auto"/>
-        </w:rPr>
-        <w:t>LỜI CẢM ƠN</w:t>
-      </w:r>
-    </w:p>
-    <w:p>
-      <w:pPr>
         <w:pStyle w:val="Mucluc1"/>
         <w:rPr>
           <w:b/>
@@ -2641,13 +2626,69 @@
           <w14:ligatures w14:val="standardContextual"/>
         </w:rPr>
       </w:pPr>
-      <w:hyperlink w:anchor="_Toc225618033" w:history="1">
+      <w:hyperlink w:anchor="_Toc226222060" w:history="1">
         <w:r>
           <w:rPr>
             <w:rStyle w:val="Siuktni"/>
             <w:b/>
             <w:bCs/>
           </w:rPr>
+          <w:t>LỜI</w:t>
+        </w:r>
+        <w:r>
+          <w:rPr>
+            <w:rStyle w:val="Siuktni"/>
+            <w:b/>
+            <w:bCs/>
+            <w:spacing w:val="-3"/>
+          </w:rPr>
+          <w:t xml:space="preserve"> </w:t>
+        </w:r>
+        <w:r>
+          <w:rPr>
+            <w:rStyle w:val="Siuktni"/>
+            <w:b/>
+            <w:bCs/>
+          </w:rPr>
+          <w:t>CẢM</w:t>
+        </w:r>
+        <w:r>
+          <w:rPr>
+            <w:rStyle w:val="Siuktni"/>
+            <w:b/>
+            <w:bCs/>
+            <w:spacing w:val="-3"/>
+          </w:rPr>
+          <w:t xml:space="preserve"> </w:t>
+        </w:r>
+        <w:r>
+          <w:rPr>
+            <w:rStyle w:val="Siuktni"/>
+            <w:b/>
+            <w:bCs/>
+            <w:spacing w:val="-5"/>
+          </w:rPr>
+          <w:t>ƠN</w:t>
+        </w:r>
+      </w:hyperlink>
+    </w:p>
+    <w:p>
+      <w:pPr>
+        <w:pStyle w:val="Mucluc1"/>
+        <w:rPr>
+          <w:b/>
+          <w:bCs/>
+          <w:kern w:val="2"/>
+          <w14:ligatures w14:val="standardContextual"/>
+        </w:rPr>
+      </w:pPr>
+      <w:hyperlink w:anchor="_Toc226222061" w:history="1">
+        <w:r>
+          <w:rPr>
+            <w:rStyle w:val="Siuktni"/>
+            <w:b/>
+            <w:bCs/>
+          </w:rPr>
           <w:t>PHẦN MỞ ĐẦU</w:t>
         </w:r>
         <w:r>
@@ -2672,7 +2713,7 @@
             <w:bCs/>
             <w:webHidden/>
           </w:rPr>
-          <w:instrText xml:space="preserve"> PAGEREF _Toc225618033 \h </w:instrText>
+          <w:instrText xml:space="preserve"> PAGEREF _Toc226222061 \h </w:instrText>
         </w:r>
         <w:r>
           <w:rPr>
@@ -2724,7 +2765,7 @@
           <w14:ligatures w14:val="standardContextual"/>
         </w:rPr>
       </w:pPr>
-      <w:hyperlink w:anchor="_Toc225618034" w:history="1">
+      <w:hyperlink w:anchor="_Toc226222062" w:history="1">
         <w:r>
           <w:rPr>
             <w:rStyle w:val="Siuktni"/>
@@ -2771,7 +2812,7 @@
             <w:sz w:val="28"/>
             <w:szCs w:val="28"/>
           </w:rPr>
-          <w:instrText xml:space="preserve"> PAGEREF _Toc225618034 \h </w:instrText>
+          <w:instrText xml:space="preserve"> PAGEREF _Toc226222062 \h </w:instrText>
         </w:r>
         <w:r>
           <w:rPr>
@@ -2839,7 +2880,7 @@
           <w14:ligatures w14:val="standardContextual"/>
         </w:rPr>
       </w:pPr>
-      <w:hyperlink w:anchor="_Toc225618035" w:history="1">
+      <w:hyperlink w:anchor="_Toc226222063" w:history="1">
         <w:r>
           <w:rPr>
             <w:rStyle w:val="Siuktni"/>
@@ -2886,7 +2927,7 @@
             <w:sz w:val="28"/>
             <w:szCs w:val="28"/>
           </w:rPr>
-          <w:instrText xml:space="preserve"> PAGEREF _Toc225618035 \h </w:instrText>
+          <w:instrText xml:space="preserve"> PAGEREF _Toc226222063 \h </w:instrText>
         </w:r>
         <w:r>
           <w:rPr>
@@ -2954,7 +2995,7 @@
           <w14:ligatures w14:val="standardContextual"/>
         </w:rPr>
       </w:pPr>
-      <w:hyperlink w:anchor="_Toc225618036" w:history="1">
+      <w:hyperlink w:anchor="_Toc226222064" w:history="1">
         <w:r>
           <w:rPr>
             <w:rStyle w:val="Siuktni"/>
@@ -3001,7 +3042,7 @@
             <w:sz w:val="28"/>
             <w:szCs w:val="28"/>
           </w:rPr>
-          <w:instrText xml:space="preserve"> PAGEREF _Toc225618036 \h </w:instrText>
+          <w:instrText xml:space="preserve"> PAGEREF _Toc226222064 \h </w:instrText>
         </w:r>
         <w:r>
           <w:rPr>
@@ -3069,7 +3110,7 @@
           <w14:ligatures w14:val="standardContextual"/>
         </w:rPr>
       </w:pPr>
-      <w:hyperlink w:anchor="_Toc225618037" w:history="1">
+      <w:hyperlink w:anchor="_Toc226222065" w:history="1">
         <w:r>
           <w:rPr>
             <w:rStyle w:val="Siuktni"/>
@@ -3116,7 +3157,7 @@
             <w:sz w:val="28"/>
             <w:szCs w:val="28"/>
           </w:rPr>
-          <w:instrText xml:space="preserve"> PAGEREF _Toc225618037 \h </w:instrText>
+          <w:instrText xml:space="preserve"> PAGEREF _Toc226222065 \h </w:instrText>
         </w:r>
         <w:r>
           <w:rPr>
@@ -3177,7 +3218,7 @@
           <w14:ligatures w14:val="standardContextual"/>
         </w:rPr>
       </w:pPr>
-      <w:hyperlink w:anchor="_Toc225618038" w:history="1">
+      <w:hyperlink w:anchor="_Toc226222066" w:history="1">
         <w:r>
           <w:rPr>
             <w:rStyle w:val="Siuktni"/>
@@ -3208,7 +3249,7 @@
             <w:bCs/>
             <w:webHidden/>
           </w:rPr>
-          <w:instrText xml:space="preserve"> PAGEREF _Toc225618038 \h </w:instrText>
+          <w:instrText xml:space="preserve"> PAGEREF _Toc226222066 \h </w:instrText>
         </w:r>
         <w:r>
           <w:rPr>
@@ -3253,7 +3294,7 @@
           <w14:ligatures w14:val="standardContextual"/>
         </w:rPr>
       </w:pPr>
-      <w:hyperlink w:anchor="_Toc225618039" w:history="1">
+      <w:hyperlink w:anchor="_Toc226222067" w:history="1">
         <w:r>
           <w:rPr>
             <w:rStyle w:val="Siuktni"/>
@@ -3284,7 +3325,7 @@
             <w:bCs/>
             <w:webHidden/>
           </w:rPr>
-          <w:instrText xml:space="preserve"> PAGEREF _Toc225618039 \h </w:instrText>
+          <w:instrText xml:space="preserve"> PAGEREF _Toc226222067 \h </w:instrText>
         </w:r>
         <w:r>
           <w:rPr>
@@ -3336,7 +3377,7 @@
           <w14:ligatures w14:val="standardContextual"/>
         </w:rPr>
       </w:pPr>
-      <w:hyperlink w:anchor="_Toc225618040" w:history="1">
+      <w:hyperlink w:anchor="_Toc226222068" w:history="1">
         <w:r>
           <w:rPr>
             <w:rStyle w:val="Siuktni"/>
@@ -3383,7 +3424,7 @@
             <w:sz w:val="28"/>
             <w:szCs w:val="28"/>
           </w:rPr>
-          <w:instrText xml:space="preserve"> PAGEREF _Toc225618040 \h </w:instrText>
+          <w:instrText xml:space="preserve"> PAGEREF _Toc226222068 \h </w:instrText>
         </w:r>
         <w:r>
           <w:rPr>
@@ -3451,7 +3492,7 @@
           <w14:ligatures w14:val="standardContextual"/>
         </w:rPr>
       </w:pPr>
-      <w:hyperlink w:anchor="_Toc225618041" w:history="1">
+      <w:hyperlink w:anchor="_Toc226222069" w:history="1">
         <w:r>
           <w:rPr>
             <w:rStyle w:val="Siuktni"/>
@@ -3498,7 +3539,7 @@
             <w:sz w:val="28"/>
             <w:szCs w:val="28"/>
           </w:rPr>
-          <w:instrText xml:space="preserve"> PAGEREF _Toc225618041 \h </w:instrText>
+          <w:instrText xml:space="preserve"> PAGEREF _Toc226222069 \h </w:instrText>
         </w:r>
         <w:r>
           <w:rPr>
@@ -3566,7 +3607,7 @@
           <w14:ligatures w14:val="standardContextual"/>
         </w:rPr>
       </w:pPr>
-      <w:hyperlink w:anchor="_Toc225618042" w:history="1">
+      <w:hyperlink w:anchor="_Toc226222070" w:history="1">
         <w:r>
           <w:rPr>
             <w:rStyle w:val="Siuktni"/>
@@ -3613,7 +3654,7 @@
             <w:sz w:val="28"/>
             <w:szCs w:val="28"/>
           </w:rPr>
-          <w:instrText xml:space="preserve"> PAGEREF _Toc225618042 \h </w:instrText>
+          <w:instrText xml:space="preserve"> PAGEREF _Toc226222070 \h </w:instrText>
         </w:r>
         <w:r>
           <w:rPr>
@@ -3681,7 +3722,7 @@
           <w14:ligatures w14:val="standardContextual"/>
         </w:rPr>
       </w:pPr>
-      <w:hyperlink w:anchor="_Toc225618043" w:history="1">
+      <w:hyperlink w:anchor="_Toc226222071" w:history="1">
         <w:r>
           <w:rPr>
             <w:rStyle w:val="Siuktni"/>
@@ -3728,7 +3769,7 @@
             <w:sz w:val="28"/>
             <w:szCs w:val="28"/>
           </w:rPr>
-          <w:instrText xml:space="preserve"> PAGEREF _Toc225618043 \h </w:instrText>
+          <w:instrText xml:space="preserve"> PAGEREF _Toc226222071 \h </w:instrText>
         </w:r>
         <w:r>
           <w:rPr>
@@ -3796,7 +3837,7 @@
           <w14:ligatures w14:val="standardContextual"/>
         </w:rPr>
       </w:pPr>
-      <w:hyperlink w:anchor="_Toc225618044" w:history="1">
+      <w:hyperlink w:anchor="_Toc226222072" w:history="1">
         <w:r>
           <w:rPr>
             <w:rStyle w:val="Siuktni"/>
@@ -3843,7 +3884,7 @@
             <w:sz w:val="28"/>
             <w:szCs w:val="28"/>
           </w:rPr>
-          <w:instrText xml:space="preserve"> PAGEREF _Toc225618044 \h </w:instrText>
+          <w:instrText xml:space="preserve"> PAGEREF _Toc226222072 \h </w:instrText>
         </w:r>
         <w:r>
           <w:rPr>
@@ -3904,7 +3945,7 @@
           <w14:ligatures w14:val="standardContextual"/>
         </w:rPr>
       </w:pPr>
-      <w:hyperlink w:anchor="_Toc225618045" w:history="1">
+      <w:hyperlink w:anchor="_Toc226222073" w:history="1">
         <w:r>
           <w:rPr>
             <w:rStyle w:val="Siuktni"/>
@@ -3935,7 +3976,7 @@
             <w:bCs/>
             <w:webHidden/>
           </w:rPr>
-          <w:instrText xml:space="preserve"> PAGEREF _Toc225618045 \h </w:instrText>
+          <w:instrText xml:space="preserve"> PAGEREF _Toc226222073 \h </w:instrText>
         </w:r>
         <w:r>
           <w:rPr>
@@ -3987,7 +4028,7 @@
           <w14:ligatures w14:val="standardContextual"/>
         </w:rPr>
       </w:pPr>
-      <w:hyperlink w:anchor="_Toc225618046" w:history="1">
+      <w:hyperlink w:anchor="_Toc226222074" w:history="1">
         <w:r>
           <w:rPr>
             <w:rStyle w:val="Siuktni"/>
@@ -4034,7 +4075,7 @@
             <w:sz w:val="28"/>
             <w:szCs w:val="28"/>
           </w:rPr>
-          <w:instrText xml:space="preserve"> PAGEREF _Toc225618046 \h </w:instrText>
+          <w:instrText xml:space="preserve"> PAGEREF _Toc226222074 \h </w:instrText>
         </w:r>
         <w:r>
           <w:rPr>
@@ -4102,7 +4143,7 @@
           <w14:ligatures w14:val="standardContextual"/>
         </w:rPr>
       </w:pPr>
-      <w:hyperlink w:anchor="_Toc225618047" w:history="1">
+      <w:hyperlink w:anchor="_Toc226222075" w:history="1">
         <w:r>
           <w:rPr>
             <w:rStyle w:val="Siuktni"/>
@@ -4149,7 +4190,7 @@
             <w:sz w:val="28"/>
             <w:szCs w:val="28"/>
           </w:rPr>
-          <w:instrText xml:space="preserve"> PAGEREF _Toc225618047 \h </w:instrText>
+          <w:instrText xml:space="preserve"> PAGEREF _Toc226222075 \h </w:instrText>
         </w:r>
         <w:r>
           <w:rPr>
@@ -4217,7 +4258,7 @@
           <w14:ligatures w14:val="standardContextual"/>
         </w:rPr>
       </w:pPr>
-      <w:hyperlink w:anchor="_Toc225618048" w:history="1">
+      <w:hyperlink w:anchor="_Toc226222076" w:history="1">
         <w:r>
           <w:rPr>
             <w:rStyle w:val="Siuktni"/>
@@ -4264,7 +4305,7 @@
             <w:sz w:val="28"/>
             <w:szCs w:val="28"/>
           </w:rPr>
-          <w:instrText xml:space="preserve"> PAGEREF _Toc225618048 \h </w:instrText>
+          <w:instrText xml:space="preserve"> PAGEREF _Toc226222076 \h </w:instrText>
         </w:r>
         <w:r>
           <w:rPr>
@@ -4332,7 +4373,7 @@
           <w14:ligatures w14:val="standardContextual"/>
         </w:rPr>
       </w:pPr>
-      <w:hyperlink w:anchor="_Toc225618049" w:history="1">
+      <w:hyperlink w:anchor="_Toc226222077" w:history="1">
         <w:r>
           <w:rPr>
             <w:rStyle w:val="Siuktni"/>
@@ -4379,7 +4420,7 @@
             <w:sz w:val="28"/>
             <w:szCs w:val="28"/>
           </w:rPr>
-          <w:instrText xml:space="preserve"> PAGEREF _Toc225618049 \h </w:instrText>
+          <w:instrText xml:space="preserve"> PAGEREF _Toc226222077 \h </w:instrText>
         </w:r>
         <w:r>
           <w:rPr>
@@ -4447,7 +4488,7 @@
           <w14:ligatures w14:val="standardContextual"/>
         </w:rPr>
       </w:pPr>
-      <w:hyperlink w:anchor="_Toc225618050" w:history="1">
+      <w:hyperlink w:anchor="_Toc226222078" w:history="1">
         <w:r>
           <w:rPr>
             <w:rStyle w:val="Siuktni"/>
@@ -4494,7 +4535,7 @@
             <w:sz w:val="28"/>
             <w:szCs w:val="28"/>
           </w:rPr>
-          <w:instrText xml:space="preserve"> PAGEREF _Toc225618050 \h </w:instrText>
+          <w:instrText xml:space="preserve"> PAGEREF _Toc226222078 \h </w:instrText>
         </w:r>
         <w:r>
           <w:rPr>
@@ -4562,7 +4603,7 @@
           <w14:ligatures w14:val="standardContextual"/>
         </w:rPr>
       </w:pPr>
-      <w:hyperlink w:anchor="_Toc225618051" w:history="1">
+      <w:hyperlink w:anchor="_Toc226222079" w:history="1">
         <w:r>
           <w:rPr>
             <w:rStyle w:val="Siuktni"/>
@@ -4609,7 +4650,7 @@
             <w:sz w:val="28"/>
             <w:szCs w:val="28"/>
           </w:rPr>
-          <w:instrText xml:space="preserve"> PAGEREF _Toc225618051 \h </w:instrText>
+          <w:instrText xml:space="preserve"> PAGEREF _Toc226222079 \h </w:instrText>
         </w:r>
         <w:r>
           <w:rPr>
@@ -4677,7 +4718,7 @@
           <w14:ligatures w14:val="standardContextual"/>
         </w:rPr>
       </w:pPr>
-      <w:hyperlink w:anchor="_Toc225618052" w:history="1">
+      <w:hyperlink w:anchor="_Toc226222080" w:history="1">
         <w:r>
           <w:rPr>
             <w:rStyle w:val="Siuktni"/>
@@ -4724,7 +4765,7 @@
             <w:sz w:val="28"/>
             <w:szCs w:val="28"/>
           </w:rPr>
-          <w:instrText xml:space="preserve"> PAGEREF _Toc225618052 \h </w:instrText>
+          <w:instrText xml:space="preserve"> PAGEREF _Toc226222080 \h </w:instrText>
         </w:r>
         <w:r>
           <w:rPr>
@@ -4792,7 +4833,7 @@
           <w14:ligatures w14:val="standardContextual"/>
         </w:rPr>
       </w:pPr>
-      <w:hyperlink w:anchor="_Toc225618053" w:history="1">
+      <w:hyperlink w:anchor="_Toc226222081" w:history="1">
         <w:r>
           <w:rPr>
             <w:rStyle w:val="Siuktni"/>
@@ -4839,7 +4880,7 @@
             <w:sz w:val="28"/>
             <w:szCs w:val="28"/>
           </w:rPr>
-          <w:instrText xml:space="preserve"> PAGEREF _Toc225618053 \h </w:instrText>
+          <w:instrText xml:space="preserve"> PAGEREF _Toc226222081 \h </w:instrText>
         </w:r>
         <w:r>
           <w:rPr>
@@ -4907,7 +4948,7 @@
           <w14:ligatures w14:val="standardContextual"/>
         </w:rPr>
       </w:pPr>
-      <w:hyperlink w:anchor="_Toc225618054" w:history="1">
+      <w:hyperlink w:anchor="_Toc226222082" w:history="1">
         <w:r>
           <w:rPr>
             <w:rStyle w:val="Siuktni"/>
@@ -4954,7 +4995,7 @@
             <w:sz w:val="28"/>
             <w:szCs w:val="28"/>
           </w:rPr>
-          <w:instrText xml:space="preserve"> PAGEREF _Toc225618054 \h </w:instrText>
+          <w:instrText xml:space="preserve"> PAGEREF _Toc226222082 \h </w:instrText>
         </w:r>
         <w:r>
           <w:rPr>
@@ -5022,7 +5063,7 @@
           <w14:ligatures w14:val="standardContextual"/>
         </w:rPr>
       </w:pPr>
-      <w:hyperlink w:anchor="_Toc225618055" w:history="1">
+      <w:hyperlink w:anchor="_Toc226222083" w:history="1">
         <w:r>
           <w:rPr>
             <w:rStyle w:val="Siuktni"/>
@@ -5069,7 +5110,7 @@
             <w:sz w:val="28"/>
             <w:szCs w:val="28"/>
           </w:rPr>
-          <w:instrText xml:space="preserve"> PAGEREF _Toc225618055 \h </w:instrText>
+          <w:instrText xml:space="preserve"> PAGEREF _Toc226222083 \h </w:instrText>
         </w:r>
         <w:r>
           <w:rPr>
@@ -5137,7 +5178,7 @@
           <w14:ligatures w14:val="standardContextual"/>
         </w:rPr>
       </w:pPr>
-      <w:hyperlink w:anchor="_Toc225618056" w:history="1">
+      <w:hyperlink w:anchor="_Toc226222084" w:history="1">
         <w:r>
           <w:rPr>
             <w:rStyle w:val="Siuktni"/>
@@ -5184,7 +5225,7 @@
             <w:sz w:val="28"/>
             <w:szCs w:val="28"/>
           </w:rPr>
-          <w:instrText xml:space="preserve"> PAGEREF _Toc225618056 \h </w:instrText>
+          <w:instrText xml:space="preserve"> PAGEREF _Toc226222084 \h </w:instrText>
         </w:r>
         <w:r>
           <w:rPr>
@@ -5252,7 +5293,7 @@
           <w14:ligatures w14:val="standardContextual"/>
         </w:rPr>
       </w:pPr>
-      <w:hyperlink w:anchor="_Toc225618057" w:history="1">
+      <w:hyperlink w:anchor="_Toc226222085" w:history="1">
         <w:r>
           <w:rPr>
             <w:rStyle w:val="Siuktni"/>
@@ -5299,7 +5340,7 @@
             <w:sz w:val="28"/>
             <w:szCs w:val="28"/>
           </w:rPr>
-          <w:instrText xml:space="preserve"> PAGEREF _Toc225618057 \h </w:instrText>
+          <w:instrText xml:space="preserve"> PAGEREF _Toc226222085 \h </w:instrText>
         </w:r>
         <w:r>
           <w:rPr>
@@ -5367,7 +5408,7 @@
           <w14:ligatures w14:val="standardContextual"/>
         </w:rPr>
       </w:pPr>
-      <w:hyperlink w:anchor="_Toc225618058" w:history="1">
+      <w:hyperlink w:anchor="_Toc226222086" w:history="1">
         <w:r>
           <w:rPr>
             <w:rStyle w:val="Siuktni"/>
@@ -5414,7 +5455,7 @@
             <w:sz w:val="28"/>
             <w:szCs w:val="28"/>
           </w:rPr>
-          <w:instrText xml:space="preserve"> PAGEREF _Toc225618058 \h </w:instrText>
+          <w:instrText xml:space="preserve"> PAGEREF _Toc226222086 \h </w:instrText>
         </w:r>
         <w:r>
           <w:rPr>
@@ -5482,7 +5523,7 @@
           <w14:ligatures w14:val="standardContextual"/>
         </w:rPr>
       </w:pPr>
-      <w:hyperlink w:anchor="_Toc225618059" w:history="1">
+      <w:hyperlink w:anchor="_Toc226222087" w:history="1">
         <w:r>
           <w:rPr>
             <w:rStyle w:val="Siuktni"/>
@@ -5529,7 +5570,7 @@
             <w:sz w:val="28"/>
             <w:szCs w:val="28"/>
           </w:rPr>
-          <w:instrText xml:space="preserve"> PAGEREF _Toc225618059 \h </w:instrText>
+          <w:instrText xml:space="preserve"> PAGEREF _Toc226222087 \h </w:instrText>
         </w:r>
         <w:r>
           <w:rPr>
@@ -5590,7 +5631,7 @@
           <w14:ligatures w14:val="standardContextual"/>
         </w:rPr>
       </w:pPr>
-      <w:hyperlink w:anchor="_Toc225618060" w:history="1">
+      <w:hyperlink w:anchor="_Toc226222088" w:history="1">
         <w:r>
           <w:rPr>
             <w:rStyle w:val="Siuktni"/>
@@ -5621,7 +5662,7 @@
             <w:bCs/>
             <w:webHidden/>
           </w:rPr>
-          <w:instrText xml:space="preserve"> PAGEREF _Toc225618060 \h </w:instrText>
+          <w:instrText xml:space="preserve"> PAGEREF _Toc226222088 \h </w:instrText>
         </w:r>
         <w:r>
           <w:rPr>
@@ -5673,7 +5714,7 @@
           <w14:ligatures w14:val="standardContextual"/>
         </w:rPr>
       </w:pPr>
-      <w:hyperlink w:anchor="_Toc225618061" w:history="1">
+      <w:hyperlink w:anchor="_Toc226222089" w:history="1">
         <w:r>
           <w:rPr>
             <w:rStyle w:val="Siuktni"/>
@@ -5720,7 +5761,7 @@
             <w:sz w:val="28"/>
             <w:szCs w:val="28"/>
           </w:rPr>
-          <w:instrText xml:space="preserve"> PAGEREF _Toc225618061 \h </w:instrText>
+          <w:instrText xml:space="preserve"> PAGEREF _Toc226222089 \h </w:instrText>
         </w:r>
         <w:r>
           <w:rPr>
@@ -5788,7 +5829,7 @@
           <w14:ligatures w14:val="standardContextual"/>
         </w:rPr>
       </w:pPr>
-      <w:hyperlink w:anchor="_Toc225618062" w:history="1">
+      <w:hyperlink w:anchor="_Toc226222090" w:history="1">
         <w:r>
           <w:rPr>
             <w:rStyle w:val="Siuktni"/>
@@ -5835,7 +5876,7 @@
             <w:sz w:val="28"/>
             <w:szCs w:val="28"/>
           </w:rPr>
-          <w:instrText xml:space="preserve"> PAGEREF _Toc225618062 \h </w:instrText>
+          <w:instrText xml:space="preserve"> PAGEREF _Toc226222090 \h </w:instrText>
         </w:r>
         <w:r>
           <w:rPr>
@@ -5903,7 +5944,7 @@
           <w14:ligatures w14:val="standardContextual"/>
         </w:rPr>
       </w:pPr>
-      <w:hyperlink w:anchor="_Toc225618063" w:history="1">
+      <w:hyperlink w:anchor="_Toc226222091" w:history="1">
         <w:r>
           <w:rPr>
             <w:rStyle w:val="Siuktni"/>
@@ -5950,7 +5991,7 @@
             <w:sz w:val="28"/>
             <w:szCs w:val="28"/>
           </w:rPr>
-          <w:instrText xml:space="preserve"> PAGEREF _Toc225618063 \h </w:instrText>
+          <w:instrText xml:space="preserve"> PAGEREF _Toc226222091 \h </w:instrText>
         </w:r>
         <w:r>
           <w:rPr>
@@ -6018,7 +6059,7 @@
           <w14:ligatures w14:val="standardContextual"/>
         </w:rPr>
       </w:pPr>
-      <w:hyperlink w:anchor="_Toc225618064" w:history="1">
+      <w:hyperlink w:anchor="_Toc226222092" w:history="1">
         <w:r>
           <w:rPr>
             <w:rStyle w:val="Siuktni"/>
@@ -6065,7 +6106,7 @@
             <w:sz w:val="28"/>
             <w:szCs w:val="28"/>
           </w:rPr>
-          <w:instrText xml:space="preserve"> PAGEREF _Toc225618064 \h </w:instrText>
+          <w:instrText xml:space="preserve"> PAGEREF _Toc226222092 \h </w:instrText>
         </w:r>
         <w:r>
           <w:rPr>
@@ -6133,7 +6174,7 @@
           <w14:ligatures w14:val="standardContextual"/>
         </w:rPr>
       </w:pPr>
-      <w:hyperlink w:anchor="_Toc225618065" w:history="1">
+      <w:hyperlink w:anchor="_Toc226222093" w:history="1">
         <w:r>
           <w:rPr>
             <w:rStyle w:val="Siuktni"/>
@@ -6180,7 +6221,7 @@
             <w:sz w:val="28"/>
             <w:szCs w:val="28"/>
           </w:rPr>
-          <w:instrText xml:space="preserve"> PAGEREF _Toc225618065 \h </w:instrText>
+          <w:instrText xml:space="preserve"> PAGEREF _Toc226222093 \h </w:instrText>
         </w:r>
         <w:r>
           <w:rPr>
@@ -6248,7 +6289,7 @@
           <w14:ligatures w14:val="standardContextual"/>
         </w:rPr>
       </w:pPr>
-      <w:hyperlink w:anchor="_Toc225618066" w:history="1">
+      <w:hyperlink w:anchor="_Toc226222094" w:history="1">
         <w:r>
           <w:rPr>
             <w:rStyle w:val="Siuktni"/>
@@ -6295,7 +6336,7 @@
             <w:sz w:val="28"/>
             <w:szCs w:val="28"/>
           </w:rPr>
-          <w:instrText xml:space="preserve"> PAGEREF _Toc225618066 \h </w:instrText>
+          <w:instrText xml:space="preserve"> PAGEREF _Toc226222094 \h </w:instrText>
         </w:r>
         <w:r>
           <w:rPr>
@@ -6356,7 +6397,7 @@
           <w14:ligatures w14:val="standardContextual"/>
         </w:rPr>
       </w:pPr>
-      <w:hyperlink w:anchor="_Toc225618067" w:history="1">
+      <w:hyperlink w:anchor="_Toc226222095" w:history="1">
         <w:r>
           <w:rPr>
             <w:rStyle w:val="Siuktni"/>
@@ -6387,7 +6428,7 @@
             <w:bCs/>
             <w:webHidden/>
           </w:rPr>
-          <w:instrText xml:space="preserve"> PAGEREF _Toc225618067 \h </w:instrText>
+          <w:instrText xml:space="preserve"> PAGEREF _Toc226222095 \h </w:instrText>
         </w:r>
         <w:r>
           <w:rPr>
@@ -6439,7 +6480,7 @@
           <w14:ligatures w14:val="standardContextual"/>
         </w:rPr>
       </w:pPr>
-      <w:hyperlink w:anchor="_Toc225618068" w:history="1">
+      <w:hyperlink w:anchor="_Toc226222096" w:history="1">
         <w:r>
           <w:rPr>
             <w:rStyle w:val="Siuktni"/>
@@ -6486,7 +6527,7 @@
             <w:sz w:val="28"/>
             <w:szCs w:val="28"/>
           </w:rPr>
-          <w:instrText xml:space="preserve"> PAGEREF _Toc225618068 \h </w:instrText>
+          <w:instrText xml:space="preserve"> PAGEREF _Toc226222096 \h </w:instrText>
         </w:r>
         <w:r>
           <w:rPr>
@@ -6554,7 +6595,7 @@
           <w14:ligatures w14:val="standardContextual"/>
         </w:rPr>
       </w:pPr>
-      <w:hyperlink w:anchor="_Toc225618069" w:history="1">
+      <w:hyperlink w:anchor="_Toc226222097" w:history="1">
         <w:r>
           <w:rPr>
             <w:rStyle w:val="Siuktni"/>
@@ -6601,7 +6642,7 @@
             <w:sz w:val="28"/>
             <w:szCs w:val="28"/>
           </w:rPr>
-          <w:instrText xml:space="preserve"> PAGEREF _Toc225618069 \h </w:instrText>
+          <w:instrText xml:space="preserve"> PAGEREF _Toc226222097 \h </w:instrText>
         </w:r>
         <w:r>
           <w:rPr>
@@ -6669,7 +6710,7 @@
           <w14:ligatures w14:val="standardContextual"/>
         </w:rPr>
       </w:pPr>
-      <w:hyperlink w:anchor="_Toc225618070" w:history="1">
+      <w:hyperlink w:anchor="_Toc226222098" w:history="1">
         <w:r>
           <w:rPr>
             <w:rStyle w:val="Siuktni"/>
@@ -6716,7 +6757,7 @@
             <w:sz w:val="28"/>
             <w:szCs w:val="28"/>
           </w:rPr>
-          <w:instrText xml:space="preserve"> PAGEREF _Toc225618070 \h </w:instrText>
+          <w:instrText xml:space="preserve"> PAGEREF _Toc226222098 \h </w:instrText>
         </w:r>
         <w:r>
           <w:rPr>
@@ -6784,7 +6825,7 @@
           <w14:ligatures w14:val="standardContextual"/>
         </w:rPr>
       </w:pPr>
-      <w:hyperlink w:anchor="_Toc225618071" w:history="1">
+      <w:hyperlink w:anchor="_Toc226222099" w:history="1">
         <w:r>
           <w:rPr>
             <w:rStyle w:val="Siuktni"/>
@@ -6831,7 +6872,7 @@
             <w:sz w:val="28"/>
             <w:szCs w:val="28"/>
           </w:rPr>
-          <w:instrText xml:space="preserve"> PAGEREF _Toc225618071 \h </w:instrText>
+          <w:instrText xml:space="preserve"> PAGEREF _Toc226222099 \h </w:instrText>
         </w:r>
         <w:r>
           <w:rPr>
@@ -6866,7 +6907,7 @@
             <w:sz w:val="28"/>
             <w:szCs w:val="28"/>
           </w:rPr>
-          <w:t>34</w:t>
+          <w:t>33</w:t>
         </w:r>
         <w:r>
           <w:rPr>
@@ -6899,7 +6940,7 @@
           <w14:ligatures w14:val="standardContextual"/>
         </w:rPr>
       </w:pPr>
-      <w:hyperlink w:anchor="_Toc225618072" w:history="1">
+      <w:hyperlink w:anchor="_Toc226222100" w:history="1">
         <w:r>
           <w:rPr>
             <w:rStyle w:val="Siuktni"/>
@@ -6946,7 +6987,7 @@
             <w:sz w:val="28"/>
             <w:szCs w:val="28"/>
           </w:rPr>
-          <w:instrText xml:space="preserve"> PAGEREF _Toc225618072 \h </w:instrText>
+          <w:instrText xml:space="preserve"> PAGEREF _Toc226222100 \h </w:instrText>
         </w:r>
         <w:r>
           <w:rPr>
@@ -7014,7 +7055,7 @@
           <w14:ligatures w14:val="standardContextual"/>
         </w:rPr>
       </w:pPr>
-      <w:hyperlink w:anchor="_Toc225618073" w:history="1">
+      <w:hyperlink w:anchor="_Toc226222101" w:history="1">
         <w:r>
           <w:rPr>
             <w:rStyle w:val="Siuktni"/>
@@ -7061,7 +7102,7 @@
             <w:sz w:val="28"/>
             <w:szCs w:val="28"/>
           </w:rPr>
-          <w:instrText xml:space="preserve"> PAGEREF _Toc225618073 \h </w:instrText>
+          <w:instrText xml:space="preserve"> PAGEREF _Toc226222101 \h </w:instrText>
         </w:r>
         <w:r>
           <w:rPr>
@@ -7129,7 +7170,7 @@
           <w14:ligatures w14:val="standardContextual"/>
         </w:rPr>
       </w:pPr>
-      <w:hyperlink w:anchor="_Toc225618074" w:history="1">
+      <w:hyperlink w:anchor="_Toc226222102" w:history="1">
         <w:r>
           <w:rPr>
             <w:rStyle w:val="Siuktni"/>
@@ -7176,7 +7217,7 @@
             <w:sz w:val="28"/>
             <w:szCs w:val="28"/>
           </w:rPr>
-          <w:instrText xml:space="preserve"> PAGEREF _Toc225618074 \h </w:instrText>
+          <w:instrText xml:space="preserve"> PAGEREF _Toc226222102 \h </w:instrText>
         </w:r>
         <w:r>
           <w:rPr>
@@ -7211,7 +7252,7 @@
             <w:sz w:val="28"/>
             <w:szCs w:val="28"/>
           </w:rPr>
-          <w:t>39</w:t>
+          <w:t>41</w:t>
         </w:r>
         <w:r>
           <w:rPr>
@@ -7244,7 +7285,7 @@
           <w14:ligatures w14:val="standardContextual"/>
         </w:rPr>
       </w:pPr>
-      <w:hyperlink w:anchor="_Toc225618075" w:history="1">
+      <w:hyperlink w:anchor="_Toc226222103" w:history="1">
         <w:r>
           <w:rPr>
             <w:rStyle w:val="Siuktni"/>
@@ -7291,7 +7332,7 @@
             <w:sz w:val="28"/>
             <w:szCs w:val="28"/>
           </w:rPr>
-          <w:instrText xml:space="preserve"> PAGEREF _Toc225618075 \h </w:instrText>
+          <w:instrText xml:space="preserve"> PAGEREF _Toc226222103 \h </w:instrText>
         </w:r>
         <w:r>
           <w:rPr>
@@ -7326,7 +7367,7 @@
             <w:sz w:val="28"/>
             <w:szCs w:val="28"/>
           </w:rPr>
-          <w:t>43</w:t>
+          <w:t>46</w:t>
         </w:r>
         <w:r>
           <w:rPr>
@@ -7359,7 +7400,7 @@
           <w14:ligatures w14:val="standardContextual"/>
         </w:rPr>
       </w:pPr>
-      <w:hyperlink w:anchor="_Toc225618076" w:history="1">
+      <w:hyperlink w:anchor="_Toc226222104" w:history="1">
         <w:r>
           <w:rPr>
             <w:rStyle w:val="Siuktni"/>
@@ -7406,7 +7447,7 @@
             <w:sz w:val="28"/>
             <w:szCs w:val="28"/>
           </w:rPr>
-          <w:instrText xml:space="preserve"> PAGEREF _Toc225618076 \h </w:instrText>
+          <w:instrText xml:space="preserve"> PAGEREF _Toc226222104 \h </w:instrText>
         </w:r>
         <w:r>
           <w:rPr>
@@ -7441,7 +7482,7 @@
             <w:sz w:val="28"/>
             <w:szCs w:val="28"/>
           </w:rPr>
-          <w:t>45</w:t>
+          <w:t>48</w:t>
         </w:r>
         <w:r>
           <w:rPr>
@@ -7474,7 +7515,7 @@
           <w14:ligatures w14:val="standardContextual"/>
         </w:rPr>
       </w:pPr>
-      <w:hyperlink w:anchor="_Toc225618077" w:history="1">
+      <w:hyperlink w:anchor="_Toc226222105" w:history="1">
         <w:r>
           <w:rPr>
             <w:rStyle w:val="Siuktni"/>
@@ -7521,7 +7562,7 @@
             <w:sz w:val="28"/>
             <w:szCs w:val="28"/>
           </w:rPr>
-          <w:instrText xml:space="preserve"> PAGEREF _Toc225618077 \h </w:instrText>
+          <w:instrText xml:space="preserve"> PAGEREF _Toc226222105 \h </w:instrText>
         </w:r>
         <w:r>
           <w:rPr>
@@ -7556,7 +7597,7 @@
             <w:sz w:val="28"/>
             <w:szCs w:val="28"/>
           </w:rPr>
-          <w:t>46</w:t>
+          <w:t>50</w:t>
         </w:r>
         <w:r>
           <w:rPr>
@@ -7589,7 +7630,7 @@
           <w14:ligatures w14:val="standardContextual"/>
         </w:rPr>
       </w:pPr>
-      <w:hyperlink w:anchor="_Toc225618078" w:history="1">
+      <w:hyperlink w:anchor="_Toc226222106" w:history="1">
         <w:r>
           <w:rPr>
             <w:rStyle w:val="Siuktni"/>
@@ -7636,7 +7677,7 @@
             <w:sz w:val="28"/>
             <w:szCs w:val="28"/>
           </w:rPr>
-          <w:instrText xml:space="preserve"> PAGEREF _Toc225618078 \h </w:instrText>
+          <w:instrText xml:space="preserve"> PAGEREF _Toc226222106 \h </w:instrText>
         </w:r>
         <w:r>
           <w:rPr>
@@ -7671,7 +7712,7 @@
             <w:sz w:val="28"/>
             <w:szCs w:val="28"/>
           </w:rPr>
-          <w:t>47</w:t>
+          <w:t>51</w:t>
         </w:r>
         <w:r>
           <w:rPr>
@@ -7697,7 +7738,7 @@
           <w14:ligatures w14:val="standardContextual"/>
         </w:rPr>
       </w:pPr>
-      <w:hyperlink w:anchor="_Toc225618079" w:history="1">
+      <w:hyperlink w:anchor="_Toc226222107" w:history="1">
         <w:r>
           <w:rPr>
             <w:rStyle w:val="Siuktni"/>
@@ -7728,7 +7769,7 @@
             <w:bCs/>
             <w:webHidden/>
           </w:rPr>
-          <w:instrText xml:space="preserve"> PAGEREF _Toc225618079 \h </w:instrText>
+          <w:instrText xml:space="preserve"> PAGEREF _Toc226222107 \h </w:instrText>
         </w:r>
         <w:r>
           <w:rPr>
@@ -7751,7 +7792,7 @@
             <w:bCs/>
             <w:webHidden/>
           </w:rPr>
-          <w:t>48</w:t>
+          <w:t>52</w:t>
         </w:r>
         <w:r>
           <w:rPr>
@@ -7780,7 +7821,7 @@
           <w14:ligatures w14:val="standardContextual"/>
         </w:rPr>
       </w:pPr>
-      <w:hyperlink w:anchor="_Toc225618080" w:history="1">
+      <w:hyperlink w:anchor="_Toc226222108" w:history="1">
         <w:r>
           <w:rPr>
             <w:rStyle w:val="Siuktni"/>
@@ -7827,7 +7868,7 @@
             <w:sz w:val="28"/>
             <w:szCs w:val="28"/>
           </w:rPr>
-          <w:instrText xml:space="preserve"> PAGEREF _Toc225618080 \h </w:instrText>
+          <w:instrText xml:space="preserve"> PAGEREF _Toc226222108 \h </w:instrText>
         </w:r>
         <w:r>
           <w:rPr>
@@ -7862,7 +7903,7 @@
             <w:sz w:val="28"/>
             <w:szCs w:val="28"/>
           </w:rPr>
-          <w:t>48</w:t>
+          <w:t>52</w:t>
         </w:r>
         <w:r>
           <w:rPr>
@@ -7895,7 +7936,7 @@
           <w14:ligatures w14:val="standardContextual"/>
         </w:rPr>
       </w:pPr>
-      <w:hyperlink w:anchor="_Toc225618081" w:history="1">
+      <w:hyperlink w:anchor="_Toc226222109" w:history="1">
         <w:r>
           <w:rPr>
             <w:rStyle w:val="Siuktni"/>
@@ -7942,7 +7983,7 @@
             <w:sz w:val="28"/>
             <w:szCs w:val="28"/>
           </w:rPr>
-          <w:instrText xml:space="preserve"> PAGEREF _Toc225618081 \h </w:instrText>
+          <w:instrText xml:space="preserve"> PAGEREF _Toc226222109 \h </w:instrText>
         </w:r>
         <w:r>
           <w:rPr>
@@ -7977,7 +8018,7 @@
             <w:sz w:val="28"/>
             <w:szCs w:val="28"/>
           </w:rPr>
-          <w:t>48</w:t>
+          <w:t>52</w:t>
         </w:r>
         <w:r>
           <w:rPr>
@@ -8010,7 +8051,7 @@
           <w14:ligatures w14:val="standardContextual"/>
         </w:rPr>
       </w:pPr>
-      <w:hyperlink w:anchor="_Toc225618082" w:history="1">
+      <w:hyperlink w:anchor="_Toc226222110" w:history="1">
         <w:r>
           <w:rPr>
             <w:rStyle w:val="Siuktni"/>
@@ -8057,7 +8098,7 @@
             <w:sz w:val="28"/>
             <w:szCs w:val="28"/>
           </w:rPr>
-          <w:instrText xml:space="preserve"> PAGEREF _Toc225618082 \h </w:instrText>
+          <w:instrText xml:space="preserve"> PAGEREF _Toc226222110 \h </w:instrText>
         </w:r>
         <w:r>
           <w:rPr>
@@ -8092,17 +8133,93 @@
             <w:sz w:val="28"/>
             <w:szCs w:val="28"/>
           </w:rPr>
-          <w:t>48</w:t>
-        </w:r>
-        <w:r>
-          <w:rPr>
-            <w:rFonts w:ascii="Times New Roman" w:hAnsi="Times New Roman"/>
-            <w:b/>
-            <w:bCs/>
-            <w:noProof/>
-            <w:webHidden/>
-            <w:sz w:val="28"/>
-            <w:szCs w:val="28"/>
+          <w:t>52</w:t>
+        </w:r>
+        <w:r>
+          <w:rPr>
+            <w:rFonts w:ascii="Times New Roman" w:hAnsi="Times New Roman"/>
+            <w:b/>
+            <w:bCs/>
+            <w:noProof/>
+            <w:webHidden/>
+            <w:sz w:val="28"/>
+            <w:szCs w:val="28"/>
+          </w:rPr>
+          <w:fldChar w:fldCharType="end"/>
+        </w:r>
+      </w:hyperlink>
+    </w:p>
+    <w:p>
+      <w:pPr>
+        <w:pStyle w:val="Mucluc1"/>
+        <w:rPr>
+          <w:b/>
+          <w:bCs/>
+          <w:kern w:val="2"/>
+          <w14:ligatures w14:val="standardContextual"/>
+        </w:rPr>
+      </w:pPr>
+      <w:hyperlink w:anchor="_Toc226222111" w:history="1">
+        <w:r>
+          <w:rPr>
+            <w:rStyle w:val="Siuktni"/>
+            <w:b/>
+            <w:bCs/>
+          </w:rPr>
+          <w:t>TÀI LIỆU THAM KHẢO</w:t>
+        </w:r>
+        <w:r>
+          <w:rPr>
+            <w:b/>
+            <w:bCs/>
+            <w:webHidden/>
+          </w:rPr>
+          <w:tab/>
+        </w:r>
+        <w:r>
+          <w:rPr>
+            <w:b/>
+            <w:bCs/>
+            <w:webHidden/>
+          </w:rPr>
+          <w:fldChar w:fldCharType="begin"/>
+        </w:r>
+        <w:r>
+          <w:rPr>
+            <w:b/>
+            <w:bCs/>
+            <w:webHidden/>
+          </w:rPr>
+          <w:instrText xml:space="preserve"> PAGEREF _Toc226222111 \h </w:instrText>
+        </w:r>
+        <w:r>
+          <w:rPr>
+            <w:b/>
+            <w:bCs/>
+            <w:webHidden/>
+          </w:rPr>
+        </w:r>
+        <w:r>
+          <w:rPr>
+            <w:b/>
+            <w:bCs/>
+            <w:webHidden/>
+          </w:rPr>
+          <w:fldChar w:fldCharType="separate"/>
+        </w:r>
+        <w:r>
+          <w:rPr>
+            <w:b/>
+            <w:bCs/>
+            <w:webHidden/>
+          </w:rPr>
+          <w:t>53</w:t>
+        </w:r>
+        <w:r>
+          <w:rPr>
+            <w:b/>
+            <w:bCs/>
+            <w:webHidden/>
           </w:rPr>
           <w:fldChar w:fldCharType="end"/>
         </w:r>
@@ -8153,7 +8270,7 @@
       <w:pPr>
         <w:pStyle w:val="u1"/>
       </w:pPr>
-      <w:bookmarkStart w:id="3" w:name="_Toc225618033"/>
+      <w:bookmarkStart w:id="3" w:name="_Toc226222061"/>
       <w:r>
         <w:lastRenderedPageBreak/>
         <w:t>P</w:t>
@@ -8167,7 +8284,7 @@
       <w:pPr>
         <w:pStyle w:val="u2"/>
       </w:pPr>
-      <w:bookmarkStart w:id="4" w:name="_Toc225618034"/>
+      <w:bookmarkStart w:id="4" w:name="_Toc226222062"/>
       <w:r>
         <w:t>1.</w:t>
       </w:r>
@@ -8234,7 +8351,7 @@
       <w:pPr>
         <w:pStyle w:val="u2"/>
       </w:pPr>
-      <w:bookmarkStart w:id="5" w:name="_Toc225618035"/>
+      <w:bookmarkStart w:id="5" w:name="_Toc226222063"/>
       <w:r>
         <w:t>2.</w:t>
       </w:r>
@@ -8317,7 +8434,7 @@
       <w:pPr>
         <w:pStyle w:val="u2"/>
       </w:pPr>
-      <w:bookmarkStart w:id="6" w:name="_Toc225618036"/>
+      <w:bookmarkStart w:id="6" w:name="_Toc226222064"/>
       <w:r>
         <w:t>3.</w:t>
       </w:r>
@@ -8485,7 +8602,7 @@
         <w:lastRenderedPageBreak/>
         <w:t xml:space="preserve"> </w:t>
       </w:r>
-      <w:bookmarkStart w:id="7" w:name="_Toc225618037"/>
+      <w:bookmarkStart w:id="7" w:name="_Toc226222065"/>
       <w:r>
         <w:t>4.</w:t>
       </w:r>
@@ -8628,7 +8745,7 @@
       <w:pPr>
         <w:pStyle w:val="u1"/>
       </w:pPr>
-      <w:bookmarkStart w:id="8" w:name="_Toc225618038"/>
+      <w:bookmarkStart w:id="8" w:name="_Toc226222066"/>
       <w:r>
         <w:lastRenderedPageBreak/>
         <w:t>PHẦN NỘI DUNG</w:t>
@@ -8639,7 +8756,7 @@
       <w:pPr>
         <w:pStyle w:val="u1"/>
       </w:pPr>
-      <w:bookmarkStart w:id="9" w:name="_Toc225618039"/>
+      <w:bookmarkStart w:id="9" w:name="_Toc226222067"/>
       <w:r>
         <w:t>Chương 1 : CƠ SỞ LÝ THUYẾT</w:t>
       </w:r>
@@ -8669,7 +8786,7 @@
       <w:pPr>
         <w:pStyle w:val="u2"/>
       </w:pPr>
-      <w:bookmarkStart w:id="10" w:name="_Toc225618040"/>
+      <w:bookmarkStart w:id="10" w:name="_Toc226222068"/>
       <w:r>
         <w:t>1.1</w:t>
       </w:r>
@@ -8742,7 +8859,7 @@
       <w:pPr>
         <w:pStyle w:val="u2"/>
       </w:pPr>
-      <w:bookmarkStart w:id="11" w:name="_Toc225618041"/>
+      <w:bookmarkStart w:id="11" w:name="_Toc226222069"/>
       <w:r>
         <w:t>1.2 Mô hình kiến trúc MVC (Model - View - Controller)</w:t>
       </w:r>
@@ -8870,7 +8987,7 @@
       <w:r>
         <w:t xml:space="preserve"> </w:t>
       </w:r>
-      <w:bookmarkStart w:id="12" w:name="_Toc225618042"/>
+      <w:bookmarkStart w:id="12" w:name="_Toc226222070"/>
       <w:r>
         <w:t>1.3 Hệ quản trị Cơ sở dữ liệu MySQL</w:t>
       </w:r>
@@ -8896,7 +9013,7 @@
       <w:pPr>
         <w:pStyle w:val="u2"/>
       </w:pPr>
-      <w:bookmarkStart w:id="13" w:name="_Toc225618043"/>
+      <w:bookmarkStart w:id="13" w:name="_Toc226222071"/>
       <w:r>
         <w:t>1.4 Công nghệ ORM và Hibernate/JPA</w:t>
       </w:r>
@@ -8970,7 +9087,7 @@
           <w:szCs w:val="27"/>
         </w:rPr>
       </w:pPr>
-      <w:bookmarkStart w:id="14" w:name="_Toc225618044"/>
+      <w:bookmarkStart w:id="14" w:name="_Toc226222072"/>
       <w:r>
         <w:t>1.5. Lập trình đa luồng (Multi-threading)</w:t>
       </w:r>
@@ -9097,7 +9214,7 @@
       <w:pPr>
         <w:pStyle w:val="u1"/>
       </w:pPr>
-      <w:bookmarkStart w:id="15" w:name="_Toc225618045"/>
+      <w:bookmarkStart w:id="15" w:name="_Toc226222073"/>
       <w:r>
         <w:t xml:space="preserve">CHƯƠNG </w:t>
       </w:r>
@@ -9113,7 +9230,7 @@
       <w:pPr>
         <w:pStyle w:val="u2"/>
       </w:pPr>
-      <w:bookmarkStart w:id="16" w:name="_Toc225618046"/>
+      <w:bookmarkStart w:id="16" w:name="_Toc226222074"/>
       <w:r>
         <w:t>2.</w:t>
       </w:r>
@@ -9160,7 +9277,7 @@
       <w:r>
         <w:t xml:space="preserve"> </w:t>
       </w:r>
-      <w:bookmarkStart w:id="17" w:name="_Toc225618047"/>
+      <w:bookmarkStart w:id="17" w:name="_Toc226222075"/>
       <w:r>
         <w:t>2.1.</w:t>
       </w:r>
@@ -9277,7 +9394,7 @@
       <w:r>
         <w:t xml:space="preserve">    </w:t>
       </w:r>
-      <w:bookmarkStart w:id="18" w:name="_Toc225618048"/>
+      <w:bookmarkStart w:id="18" w:name="_Toc226222076"/>
       <w:r>
         <w:t>2.1.2 Quyền hạn của Nhân viên bán hàng (STAFF - Thu ngân/Kho)</w:t>
       </w:r>
@@ -9377,7 +9494,7 @@
       <w:pPr>
         <w:pStyle w:val="u2"/>
       </w:pPr>
-      <w:bookmarkStart w:id="19" w:name="_Toc225618049"/>
+      <w:bookmarkStart w:id="19" w:name="_Toc226222077"/>
       <w:r>
         <w:t>2.2. Biểu đồ Use Case (Use Case Diagram)</w:t>
       </w:r>
@@ -10088,7 +10205,7 @@
       <w:pPr>
         <w:pStyle w:val="u2"/>
       </w:pPr>
-      <w:bookmarkStart w:id="20" w:name="_Toc225618050"/>
+      <w:bookmarkStart w:id="20" w:name="_Toc226222078"/>
       <w:r>
         <w:t>2.3. Biểu đồ Lớp (Class Diagram)</w:t>
       </w:r>
@@ -12230,7 +12347,7 @@
       <w:pPr>
         <w:pStyle w:val="u2"/>
       </w:pPr>
-      <w:bookmarkStart w:id="21" w:name="_Toc225618051"/>
+      <w:bookmarkStart w:id="21" w:name="_Toc226222079"/>
       <w:r>
         <w:lastRenderedPageBreak/>
         <w:t>2.4 Biểu đồ Gói (Package Diagram)</w:t>
@@ -12675,7 +12792,7 @@
       <w:pPr>
         <w:pStyle w:val="u2"/>
       </w:pPr>
-      <w:bookmarkStart w:id="22" w:name="_Toc225618052"/>
+      <w:bookmarkStart w:id="22" w:name="_Toc226222080"/>
       <w:r>
         <w:lastRenderedPageBreak/>
         <w:t>2.5 Biểu đồ Hoạt động (Activity Diagram)</w:t>
@@ -12689,7 +12806,7 @@
       <w:r>
         <w:t xml:space="preserve">    </w:t>
       </w:r>
-      <w:bookmarkStart w:id="23" w:name="_Toc225618053"/>
+      <w:bookmarkStart w:id="23" w:name="_Toc226222081"/>
       <w:r>
         <w:t>2.5.1 Activity Diagram/ Checkout</w:t>
       </w:r>
@@ -13252,7 +13369,7 @@
         <w:lastRenderedPageBreak/>
         <w:t xml:space="preserve">    </w:t>
       </w:r>
-      <w:bookmarkStart w:id="24" w:name="_Toc225618054"/>
+      <w:bookmarkStart w:id="24" w:name="_Toc226222082"/>
       <w:r>
         <w:t>2.5.2 Activity Diagram/Add Product</w:t>
       </w:r>
@@ -14016,7 +14133,7 @@
       <w:r>
         <w:t xml:space="preserve">    </w:t>
       </w:r>
-      <w:bookmarkStart w:id="25" w:name="_Toc225618055"/>
+      <w:bookmarkStart w:id="25" w:name="_Toc226222083"/>
       <w:r>
         <w:t>2.5.3 Activity Diagram/Import Product</w:t>
       </w:r>
@@ -14700,7 +14817,7 @@
       <w:pPr>
         <w:pStyle w:val="u2"/>
       </w:pPr>
-      <w:bookmarkStart w:id="26" w:name="_Toc225618056"/>
+      <w:bookmarkStart w:id="26" w:name="_Toc226222084"/>
       <w:r>
         <w:t>2.6 Biểu đồ Tuần tự (Sequence Diagram)</w:t>
       </w:r>
@@ -14713,7 +14830,7 @@
       <w:r>
         <w:t xml:space="preserve">    </w:t>
       </w:r>
-      <w:bookmarkStart w:id="27" w:name="_Toc225618057"/>
+      <w:bookmarkStart w:id="27" w:name="_Toc226222085"/>
       <w:r>
         <w:t>2.6.1 Activity Diagram/Checkout</w:t>
       </w:r>
@@ -15689,7 +15806,7 @@
       <w:r>
         <w:t xml:space="preserve">    </w:t>
       </w:r>
-      <w:bookmarkStart w:id="28" w:name="_Toc225618058"/>
+      <w:bookmarkStart w:id="28" w:name="_Toc226222086"/>
       <w:r>
         <w:t>2.6.2 Activity Digram/Add Product</w:t>
       </w:r>
@@ -16322,7 +16439,7 @@
       <w:r>
         <w:t xml:space="preserve">    </w:t>
       </w:r>
-      <w:bookmarkStart w:id="29" w:name="_Toc225618059"/>
+      <w:bookmarkStart w:id="29" w:name="_Toc226222087"/>
       <w:r>
         <w:t>2.6.3 Activity Diagram/Import Product</w:t>
       </w:r>
@@ -16837,7 +16954,7 @@
       <w:pPr>
         <w:pStyle w:val="u1"/>
       </w:pPr>
-      <w:bookmarkStart w:id="30" w:name="_Toc225618060"/>
+      <w:bookmarkStart w:id="30" w:name="_Toc226222088"/>
       <w:r>
         <w:lastRenderedPageBreak/>
         <w:t>CHƯƠNG 3: THIẾT KẾ CƠ SỞ DỮ LIỆU</w:t>
@@ -16869,7 +16986,7 @@
       <w:pPr>
         <w:pStyle w:val="u2"/>
       </w:pPr>
-      <w:bookmarkStart w:id="31" w:name="_Toc225618061"/>
+      <w:bookmarkStart w:id="31" w:name="_Toc226222089"/>
       <w:r>
         <w:t>3.1. Sơ đồ cơ sở dữ liệu (Database Schema / ERD)</w:t>
       </w:r>
@@ -16934,7 +17051,7 @@
       <w:pPr>
         <w:pStyle w:val="u2"/>
       </w:pPr>
-      <w:bookmarkStart w:id="32" w:name="_Toc225618062"/>
+      <w:bookmarkStart w:id="32" w:name="_Toc226222090"/>
       <w:r>
         <w:t>3.2 Cấu trúc bảng dữ liệu</w:t>
       </w:r>
@@ -16947,7 +17064,7 @@
       <w:r>
         <w:t xml:space="preserve">    </w:t>
       </w:r>
-      <w:bookmarkStart w:id="33" w:name="_Toc225618063"/>
+      <w:bookmarkStart w:id="33" w:name="_Toc226222091"/>
       <w:r>
         <w:t>3.2.1 Nhóm bảng Dữ liệu gốc &amp; Chiến lược (Master Data)</w:t>
       </w:r>
@@ -17091,7 +17208,7 @@
       <w:r>
         <w:t xml:space="preserve">    </w:t>
       </w:r>
-      <w:bookmarkStart w:id="34" w:name="_Toc225618064"/>
+      <w:bookmarkStart w:id="34" w:name="_Toc226222092"/>
       <w:r>
         <w:t>3.2.2 Nhóm bảng Con người</w:t>
       </w:r>
@@ -17203,7 +17320,7 @@
         <w:lastRenderedPageBreak/>
         <w:t xml:space="preserve">    </w:t>
       </w:r>
-      <w:bookmarkStart w:id="35" w:name="_Toc225618065"/>
+      <w:bookmarkStart w:id="35" w:name="_Toc226222093"/>
       <w:r>
         <w:t>3.2.3 Nhóm bảng Hàng hóa</w:t>
       </w:r>
@@ -17281,7 +17398,7 @@
       <w:r>
         <w:t xml:space="preserve">    </w:t>
       </w:r>
-      <w:bookmarkStart w:id="36" w:name="_Toc225618066"/>
+      <w:bookmarkStart w:id="36" w:name="_Toc226222094"/>
       <w:r>
         <w:t>3.2.4 Nhóm bảng Nghiệp vụ (Giao dịch)</w:t>
       </w:r>
@@ -17430,7 +17547,7 @@
       <w:pPr>
         <w:pStyle w:val="u1"/>
       </w:pPr>
-      <w:bookmarkStart w:id="37" w:name="_Toc225618067"/>
+      <w:bookmarkStart w:id="37" w:name="_Toc226222095"/>
       <w:r>
         <w:lastRenderedPageBreak/>
         <w:t>CHƯƠNG 4: TRIỂN KHAI VÀ CHI TIẾT CÁC CHỨC NĂNG HỆ THỐNG</w:t>
@@ -17459,7 +17576,7 @@
       <w:pPr>
         <w:pStyle w:val="u2"/>
       </w:pPr>
-      <w:bookmarkStart w:id="38" w:name="_Toc225618068"/>
+      <w:bookmarkStart w:id="38" w:name="_Toc226222096"/>
       <w:r>
         <w:t>4.1. Chức năng Đăng nhập và Phân quyền (Authentication)</w:t>
       </w:r>
@@ -17560,7 +17677,7 @@
       <w:pPr>
         <w:pStyle w:val="u2"/>
       </w:pPr>
-      <w:bookmarkStart w:id="39" w:name="_Toc225618069"/>
+      <w:bookmarkStart w:id="39" w:name="_Toc226222097"/>
       <w:r>
         <w:t>4.2. Tính năng tùy biến Giao diện (Dark/Light Mode Theme)</w:t>
       </w:r>
@@ -17610,10 +17727,10 @@
           <w:lang w:val="en-US"/>
         </w:rPr>
         <w:drawing>
-          <wp:inline distT="0" distB="0" distL="0" distR="0" wp14:anchorId="1A1AF6D7" wp14:editId="2077109B">
-            <wp:extent cx="5972175" cy="3977640"/>
-            <wp:effectExtent l="0" t="0" r="9525" b="3810"/>
-            <wp:docPr id="795765981" name="Hình ảnh 1"/>
+          <wp:inline distT="0" distB="0" distL="0" distR="0" wp14:anchorId="63FBF819" wp14:editId="25AC2DCA">
+            <wp:extent cx="5972175" cy="3770630"/>
+            <wp:effectExtent l="0" t="0" r="9525" b="1270"/>
+            <wp:docPr id="168217541" name="Hình ảnh 1"/>
             <wp:cNvGraphicFramePr>
               <a:graphicFrameLocks xmlns:a="http://schemas.openxmlformats.org/drawingml/2006/main" noChangeAspect="1"/>
             </wp:cNvGraphicFramePr>
@@ -17621,7 +17738,7 @@
               <a:graphicData uri="http://schemas.openxmlformats.org/drawingml/2006/picture">
                 <pic:pic xmlns:pic="http://schemas.openxmlformats.org/drawingml/2006/picture">
                   <pic:nvPicPr>
-                    <pic:cNvPr id="795765981" name=""/>
+                    <pic:cNvPr id="168217541" name=""/>
                     <pic:cNvPicPr/>
                   </pic:nvPicPr>
                   <pic:blipFill>
@@ -17633,7 +17750,7 @@
                   <pic:spPr>
                     <a:xfrm>
                       <a:off x="0" y="0"/>
-                      <a:ext cx="5972175" cy="3977640"/>
+                      <a:ext cx="5972175" cy="3770630"/>
                     </a:xfrm>
                     <a:prstGeom prst="rect">
                       <a:avLst/>
@@ -17682,12 +17799,11 @@
           <w:szCs w:val="26"/>
           <w:lang w:val="en-US"/>
         </w:rPr>
-        <w:lastRenderedPageBreak/>
         <w:drawing>
-          <wp:inline distT="0" distB="0" distL="0" distR="0" wp14:anchorId="7D5BF57F" wp14:editId="3C82CA06">
-            <wp:extent cx="5972175" cy="3971925"/>
-            <wp:effectExtent l="0" t="0" r="9525" b="9525"/>
-            <wp:docPr id="311558849" name="Hình ảnh 1"/>
+          <wp:inline distT="0" distB="0" distL="0" distR="0" wp14:anchorId="3433ACEB" wp14:editId="4AFA5208">
+            <wp:extent cx="5972175" cy="3707765"/>
+            <wp:effectExtent l="0" t="0" r="9525" b="6985"/>
+            <wp:docPr id="783257097" name="Hình ảnh 1"/>
             <wp:cNvGraphicFramePr>
               <a:graphicFrameLocks xmlns:a="http://schemas.openxmlformats.org/drawingml/2006/main" noChangeAspect="1"/>
             </wp:cNvGraphicFramePr>
@@ -17695,7 +17811,7 @@
               <a:graphicData uri="http://schemas.openxmlformats.org/drawingml/2006/picture">
                 <pic:pic xmlns:pic="http://schemas.openxmlformats.org/drawingml/2006/picture">
                   <pic:nvPicPr>
-                    <pic:cNvPr id="311558849" name=""/>
+                    <pic:cNvPr id="783257097" name=""/>
                     <pic:cNvPicPr/>
                   </pic:nvPicPr>
                   <pic:blipFill>
@@ -17707,7 +17823,7 @@
                   <pic:spPr>
                     <a:xfrm>
                       <a:off x="0" y="0"/>
-                      <a:ext cx="5972175" cy="3971925"/>
+                      <a:ext cx="5972175" cy="3707765"/>
                     </a:xfrm>
                     <a:prstGeom prst="rect">
                       <a:avLst/>
@@ -17736,6 +17852,7 @@
           <w:szCs w:val="26"/>
           <w:lang w:val="en-US"/>
         </w:rPr>
+        <w:lastRenderedPageBreak/>
         <w:t>Hình 4.2b : Giao diện tối</w:t>
       </w:r>
     </w:p>
@@ -17743,7 +17860,7 @@
       <w:pPr>
         <w:pStyle w:val="u2"/>
       </w:pPr>
-      <w:bookmarkStart w:id="40" w:name="_Toc225618070"/>
+      <w:bookmarkStart w:id="40" w:name="_Toc226222098"/>
       <w:r>
         <w:t>4.3. Quản lý Sản phẩm (Product) &amp; Cảnh báo Hạn sử dụng</w:t>
       </w:r>
@@ -17800,12 +17917,11 @@
           <w:szCs w:val="26"/>
           <w:lang w:val="en-US"/>
         </w:rPr>
-        <w:lastRenderedPageBreak/>
         <w:drawing>
-          <wp:inline distT="0" distB="0" distL="0" distR="0" wp14:anchorId="5C249F99" wp14:editId="70DBB58E">
-            <wp:extent cx="5972175" cy="3959860"/>
-            <wp:effectExtent l="0" t="0" r="9525" b="2540"/>
-            <wp:docPr id="1122878687" name="Hình ảnh 1"/>
+          <wp:inline distT="0" distB="0" distL="0" distR="0" wp14:anchorId="5C57E6C9" wp14:editId="329539D4">
+            <wp:extent cx="5972175" cy="3754120"/>
+            <wp:effectExtent l="0" t="0" r="9525" b="0"/>
+            <wp:docPr id="1073783671" name="Hình ảnh 1"/>
             <wp:cNvGraphicFramePr>
               <a:graphicFrameLocks xmlns:a="http://schemas.openxmlformats.org/drawingml/2006/main" noChangeAspect="1"/>
             </wp:cNvGraphicFramePr>
@@ -17813,7 +17929,7 @@
               <a:graphicData uri="http://schemas.openxmlformats.org/drawingml/2006/picture">
                 <pic:pic xmlns:pic="http://schemas.openxmlformats.org/drawingml/2006/picture">
                   <pic:nvPicPr>
-                    <pic:cNvPr id="1122878687" name=""/>
+                    <pic:cNvPr id="1073783671" name=""/>
                     <pic:cNvPicPr/>
                   </pic:nvPicPr>
                   <pic:blipFill>
@@ -17825,7 +17941,7 @@
                   <pic:spPr>
                     <a:xfrm>
                       <a:off x="0" y="0"/>
-                      <a:ext cx="5972175" cy="3959860"/>
+                      <a:ext cx="5972175" cy="3754120"/>
                     </a:xfrm>
                     <a:prstGeom prst="rect">
                       <a:avLst/>
@@ -17874,11 +17990,12 @@
           <w:szCs w:val="26"/>
           <w:lang w:val="en-US"/>
         </w:rPr>
+        <w:lastRenderedPageBreak/>
         <w:drawing>
-          <wp:inline distT="0" distB="0" distL="0" distR="0" wp14:anchorId="5749EF28" wp14:editId="6F1E414A">
-            <wp:extent cx="5394960" cy="3616143"/>
-            <wp:effectExtent l="0" t="0" r="0" b="3810"/>
-            <wp:docPr id="766470786" name="Hình ảnh 1"/>
+          <wp:inline distT="0" distB="0" distL="0" distR="0" wp14:anchorId="5C5A7204" wp14:editId="7722B084">
+            <wp:extent cx="5972175" cy="3787140"/>
+            <wp:effectExtent l="0" t="0" r="9525" b="3810"/>
+            <wp:docPr id="2146906768" name="Hình ảnh 1"/>
             <wp:cNvGraphicFramePr>
               <a:graphicFrameLocks xmlns:a="http://schemas.openxmlformats.org/drawingml/2006/main" noChangeAspect="1"/>
             </wp:cNvGraphicFramePr>
@@ -17886,7 +18003,7 @@
               <a:graphicData uri="http://schemas.openxmlformats.org/drawingml/2006/picture">
                 <pic:pic xmlns:pic="http://schemas.openxmlformats.org/drawingml/2006/picture">
                   <pic:nvPicPr>
-                    <pic:cNvPr id="766470786" name=""/>
+                    <pic:cNvPr id="2146906768" name=""/>
                     <pic:cNvPicPr/>
                   </pic:nvPicPr>
                   <pic:blipFill>
@@ -17898,7 +18015,7 @@
                   <pic:spPr>
                     <a:xfrm>
                       <a:off x="0" y="0"/>
-                      <a:ext cx="5397104" cy="3617580"/>
+                      <a:ext cx="5972175" cy="3787140"/>
                     </a:xfrm>
                     <a:prstGeom prst="rect">
                       <a:avLst/>
@@ -17945,9 +18062,8 @@
       <w:pPr>
         <w:pStyle w:val="u2"/>
       </w:pPr>
-      <w:bookmarkStart w:id="41" w:name="_Toc225618071"/>
-      <w:r>
-        <w:lastRenderedPageBreak/>
+      <w:bookmarkStart w:id="41" w:name="_Toc226222099"/>
+      <w:r>
         <w:t>4.4. Quản lý Chương trình Khuyến mãi (Promotions)</w:t>
       </w:r>
       <w:bookmarkEnd w:id="41"/>
@@ -18047,11 +18163,12 @@
           <w:szCs w:val="26"/>
           <w:lang w:val="en-US"/>
         </w:rPr>
+        <w:lastRenderedPageBreak/>
         <w:drawing>
-          <wp:inline distT="0" distB="0" distL="0" distR="0" wp14:anchorId="554443ED" wp14:editId="31945952">
-            <wp:extent cx="5972175" cy="4020820"/>
+          <wp:inline distT="0" distB="0" distL="0" distR="0" wp14:anchorId="485EDED9" wp14:editId="11C5EBE8">
+            <wp:extent cx="5972175" cy="4463415"/>
             <wp:effectExtent l="0" t="0" r="9525" b="0"/>
-            <wp:docPr id="450754362" name="Hình ảnh 1"/>
+            <wp:docPr id="1209099982" name="Hình ảnh 1"/>
             <wp:cNvGraphicFramePr>
               <a:graphicFrameLocks xmlns:a="http://schemas.openxmlformats.org/drawingml/2006/main" noChangeAspect="1"/>
             </wp:cNvGraphicFramePr>
@@ -18059,7 +18176,7 @@
               <a:graphicData uri="http://schemas.openxmlformats.org/drawingml/2006/picture">
                 <pic:pic xmlns:pic="http://schemas.openxmlformats.org/drawingml/2006/picture">
                   <pic:nvPicPr>
-                    <pic:cNvPr id="450754362" name=""/>
+                    <pic:cNvPr id="1209099982" name=""/>
                     <pic:cNvPicPr/>
                   </pic:nvPicPr>
                   <pic:blipFill>
@@ -18071,7 +18188,7 @@
                   <pic:spPr>
                     <a:xfrm>
                       <a:off x="0" y="0"/>
-                      <a:ext cx="5972175" cy="4020820"/>
+                      <a:ext cx="5972175" cy="4463415"/>
                     </a:xfrm>
                     <a:prstGeom prst="rect">
                       <a:avLst/>
@@ -18137,10 +18254,10 @@
         </w:rPr>
         <w:lastRenderedPageBreak/>
         <w:drawing>
-          <wp:inline distT="0" distB="0" distL="0" distR="0" wp14:anchorId="532AC2B9" wp14:editId="74FCACD4">
-            <wp:extent cx="5972175" cy="4000500"/>
-            <wp:effectExtent l="0" t="0" r="9525" b="0"/>
-            <wp:docPr id="282423914" name="Hình ảnh 1"/>
+          <wp:inline distT="0" distB="0" distL="0" distR="0" wp14:anchorId="2A86B843" wp14:editId="3A2D34FF">
+            <wp:extent cx="5972175" cy="4467860"/>
+            <wp:effectExtent l="0" t="0" r="9525" b="8890"/>
+            <wp:docPr id="1399367395" name="Hình ảnh 1"/>
             <wp:cNvGraphicFramePr>
               <a:graphicFrameLocks xmlns:a="http://schemas.openxmlformats.org/drawingml/2006/main" noChangeAspect="1"/>
             </wp:cNvGraphicFramePr>
@@ -18148,7 +18265,7 @@
               <a:graphicData uri="http://schemas.openxmlformats.org/drawingml/2006/picture">
                 <pic:pic xmlns:pic="http://schemas.openxmlformats.org/drawingml/2006/picture">
                   <pic:nvPicPr>
-                    <pic:cNvPr id="282423914" name=""/>
+                    <pic:cNvPr id="1399367395" name=""/>
                     <pic:cNvPicPr/>
                   </pic:nvPicPr>
                   <pic:blipFill>
@@ -18160,7 +18277,7 @@
                   <pic:spPr>
                     <a:xfrm>
                       <a:off x="0" y="0"/>
-                      <a:ext cx="5972175" cy="4000500"/>
+                      <a:ext cx="5972175" cy="4467860"/>
                     </a:xfrm>
                     <a:prstGeom prst="rect">
                       <a:avLst/>
@@ -18196,7 +18313,7 @@
       <w:pPr>
         <w:pStyle w:val="u2"/>
       </w:pPr>
-      <w:bookmarkStart w:id="42" w:name="_Toc225618072"/>
+      <w:bookmarkStart w:id="42" w:name="_Toc226222100"/>
       <w:r>
         <w:t>4.5. Quản lý Khách hàng &amp; Thuật toán Tích điểm (Loyalty Points)</w:t>
       </w:r>
@@ -18273,6 +18390,18 @@
     <w:p>
       <w:pPr>
         <w:spacing w:before="1" w:line="360" w:lineRule="auto"/>
+        <w:ind w:left="720" w:right="1064"/>
+        <w:jc w:val="both"/>
+        <w:rPr>
+          <w:sz w:val="26"/>
+          <w:szCs w:val="26"/>
+          <w:lang w:val="en-US"/>
+        </w:rPr>
+      </w:pPr>
+    </w:p>
+    <w:p>
+      <w:pPr>
+        <w:spacing w:before="1" w:line="360" w:lineRule="auto"/>
         <w:ind w:left="360" w:right="1064"/>
         <w:jc w:val="both"/>
         <w:rPr>
@@ -18290,10 +18419,10 @@
         </w:rPr>
         <w:lastRenderedPageBreak/>
         <w:drawing>
-          <wp:inline distT="0" distB="0" distL="0" distR="0" wp14:anchorId="48C61D6F" wp14:editId="0F743FD1">
-            <wp:extent cx="5972175" cy="4009390"/>
+          <wp:inline distT="0" distB="0" distL="0" distR="0" wp14:anchorId="340BB9AE" wp14:editId="221B8F65">
+            <wp:extent cx="5972175" cy="4462780"/>
             <wp:effectExtent l="0" t="0" r="9525" b="0"/>
-            <wp:docPr id="1220529826" name="Hình ảnh 1"/>
+            <wp:docPr id="631413349" name="Hình ảnh 1"/>
             <wp:cNvGraphicFramePr>
               <a:graphicFrameLocks xmlns:a="http://schemas.openxmlformats.org/drawingml/2006/main" noChangeAspect="1"/>
             </wp:cNvGraphicFramePr>
@@ -18301,7 +18430,7 @@
               <a:graphicData uri="http://schemas.openxmlformats.org/drawingml/2006/picture">
                 <pic:pic xmlns:pic="http://schemas.openxmlformats.org/drawingml/2006/picture">
                   <pic:nvPicPr>
-                    <pic:cNvPr id="1220529826" name=""/>
+                    <pic:cNvPr id="631413349" name=""/>
                     <pic:cNvPicPr/>
                   </pic:nvPicPr>
                   <pic:blipFill>
@@ -18313,7 +18442,7 @@
                   <pic:spPr>
                     <a:xfrm>
                       <a:off x="0" y="0"/>
-                      <a:ext cx="5972175" cy="4009390"/>
+                      <a:ext cx="5972175" cy="4462780"/>
                     </a:xfrm>
                     <a:prstGeom prst="rect">
                       <a:avLst/>
@@ -18364,11 +18493,12 @@
           <w:szCs w:val="26"/>
           <w:lang w:val="en-US"/>
         </w:rPr>
+        <w:lastRenderedPageBreak/>
         <w:drawing>
-          <wp:inline distT="0" distB="0" distL="0" distR="0" wp14:anchorId="02EC6A4D" wp14:editId="3B542EFF">
-            <wp:extent cx="5768340" cy="3835133"/>
-            <wp:effectExtent l="0" t="0" r="3810" b="0"/>
-            <wp:docPr id="43902108" name="Hình ảnh 1"/>
+          <wp:inline distT="0" distB="0" distL="0" distR="0" wp14:anchorId="465DB3E9" wp14:editId="5D7AE0DB">
+            <wp:extent cx="5972175" cy="4442460"/>
+            <wp:effectExtent l="0" t="0" r="9525" b="0"/>
+            <wp:docPr id="2032555164" name="Hình ảnh 1"/>
             <wp:cNvGraphicFramePr>
               <a:graphicFrameLocks xmlns:a="http://schemas.openxmlformats.org/drawingml/2006/main" noChangeAspect="1"/>
             </wp:cNvGraphicFramePr>
@@ -18376,7 +18506,7 @@
               <a:graphicData uri="http://schemas.openxmlformats.org/drawingml/2006/picture">
                 <pic:pic xmlns:pic="http://schemas.openxmlformats.org/drawingml/2006/picture">
                   <pic:nvPicPr>
-                    <pic:cNvPr id="43902108" name=""/>
+                    <pic:cNvPr id="2032555164" name=""/>
                     <pic:cNvPicPr/>
                   </pic:nvPicPr>
                   <pic:blipFill>
@@ -18388,7 +18518,7 @@
                   <pic:spPr>
                     <a:xfrm>
                       <a:off x="0" y="0"/>
-                      <a:ext cx="5769133" cy="3835660"/>
+                      <a:ext cx="5972175" cy="4442460"/>
                     </a:xfrm>
                     <a:prstGeom prst="rect">
                       <a:avLst/>
@@ -18425,9 +18555,8 @@
       <w:pPr>
         <w:pStyle w:val="u2"/>
       </w:pPr>
-      <w:bookmarkStart w:id="43" w:name="_Toc225618073"/>
-      <w:r>
-        <w:lastRenderedPageBreak/>
+      <w:bookmarkStart w:id="43" w:name="_Toc226222101"/>
+      <w:r>
         <w:t>4.6. Quản lý Nhà cung cấp, Thương hiệu &amp; Loại mỹ phẩm</w:t>
       </w:r>
       <w:bookmarkEnd w:id="43"/>
@@ -18518,11 +18647,12 @@
           <w:szCs w:val="26"/>
           <w:lang w:val="en-US"/>
         </w:rPr>
+        <w:lastRenderedPageBreak/>
         <w:drawing>
-          <wp:inline distT="0" distB="0" distL="0" distR="0" wp14:anchorId="1F2EBF9C" wp14:editId="5F4C87DB">
-            <wp:extent cx="6122973" cy="4099560"/>
-            <wp:effectExtent l="0" t="0" r="0" b="0"/>
-            <wp:docPr id="1937051957" name="Hình ảnh 1"/>
+          <wp:inline distT="0" distB="0" distL="0" distR="0" wp14:anchorId="216DFAB3" wp14:editId="1422CCAA">
+            <wp:extent cx="5972175" cy="4408805"/>
+            <wp:effectExtent l="0" t="0" r="9525" b="0"/>
+            <wp:docPr id="675210233" name="Hình ảnh 1"/>
             <wp:cNvGraphicFramePr>
               <a:graphicFrameLocks xmlns:a="http://schemas.openxmlformats.org/drawingml/2006/main" noChangeAspect="1"/>
             </wp:cNvGraphicFramePr>
@@ -18530,7 +18660,7 @@
               <a:graphicData uri="http://schemas.openxmlformats.org/drawingml/2006/picture">
                 <pic:pic xmlns:pic="http://schemas.openxmlformats.org/drawingml/2006/picture">
                   <pic:nvPicPr>
-                    <pic:cNvPr id="1937051957" name=""/>
+                    <pic:cNvPr id="675210233" name=""/>
                     <pic:cNvPicPr/>
                   </pic:nvPicPr>
                   <pic:blipFill>
@@ -18542,7 +18672,7 @@
                   <pic:spPr>
                     <a:xfrm>
                       <a:off x="0" y="0"/>
-                      <a:ext cx="6142798" cy="4112834"/>
+                      <a:ext cx="5972175" cy="4408805"/>
                     </a:xfrm>
                     <a:prstGeom prst="rect">
                       <a:avLst/>
@@ -18595,10 +18725,10 @@
         </w:rPr>
         <w:lastRenderedPageBreak/>
         <w:drawing>
-          <wp:inline distT="0" distB="0" distL="0" distR="0" wp14:anchorId="3076C945" wp14:editId="73BF9CE3">
-            <wp:extent cx="5972175" cy="3853180"/>
-            <wp:effectExtent l="0" t="0" r="9525" b="0"/>
-            <wp:docPr id="457544895" name="Hình ảnh 1"/>
+          <wp:inline distT="0" distB="0" distL="0" distR="0" wp14:anchorId="0F028DD9" wp14:editId="74241088">
+            <wp:extent cx="5972175" cy="4295775"/>
+            <wp:effectExtent l="0" t="0" r="9525" b="9525"/>
+            <wp:docPr id="1763050407" name="Hình ảnh 1"/>
             <wp:cNvGraphicFramePr>
               <a:graphicFrameLocks xmlns:a="http://schemas.openxmlformats.org/drawingml/2006/main" noChangeAspect="1"/>
             </wp:cNvGraphicFramePr>
@@ -18606,7 +18736,7 @@
               <a:graphicData uri="http://schemas.openxmlformats.org/drawingml/2006/picture">
                 <pic:pic xmlns:pic="http://schemas.openxmlformats.org/drawingml/2006/picture">
                   <pic:nvPicPr>
-                    <pic:cNvPr id="457544895" name=""/>
+                    <pic:cNvPr id="1763050407" name=""/>
                     <pic:cNvPicPr/>
                   </pic:nvPicPr>
                   <pic:blipFill>
@@ -18618,7 +18748,7 @@
                   <pic:spPr>
                     <a:xfrm>
                       <a:off x="0" y="0"/>
-                      <a:ext cx="5972175" cy="3853180"/>
+                      <a:ext cx="5972175" cy="4295775"/>
                     </a:xfrm>
                     <a:prstGeom prst="rect">
                       <a:avLst/>
@@ -18669,11 +18799,12 @@
           <w:szCs w:val="26"/>
           <w:lang w:val="en-US"/>
         </w:rPr>
+        <w:lastRenderedPageBreak/>
         <w:drawing>
-          <wp:inline distT="0" distB="0" distL="0" distR="0" wp14:anchorId="7CFD63A4" wp14:editId="12D5219D">
-            <wp:extent cx="5972175" cy="3989705"/>
+          <wp:inline distT="0" distB="0" distL="0" distR="0" wp14:anchorId="1B94C66C" wp14:editId="4A326C81">
+            <wp:extent cx="5972175" cy="4408170"/>
             <wp:effectExtent l="0" t="0" r="9525" b="0"/>
-            <wp:docPr id="1220230715" name="Hình ảnh 1"/>
+            <wp:docPr id="262147949" name="Hình ảnh 1"/>
             <wp:cNvGraphicFramePr>
               <a:graphicFrameLocks xmlns:a="http://schemas.openxmlformats.org/drawingml/2006/main" noChangeAspect="1"/>
             </wp:cNvGraphicFramePr>
@@ -18681,7 +18812,7 @@
               <a:graphicData uri="http://schemas.openxmlformats.org/drawingml/2006/picture">
                 <pic:pic xmlns:pic="http://schemas.openxmlformats.org/drawingml/2006/picture">
                   <pic:nvPicPr>
-                    <pic:cNvPr id="1220230715" name=""/>
+                    <pic:cNvPr id="262147949" name=""/>
                     <pic:cNvPicPr/>
                   </pic:nvPicPr>
                   <pic:blipFill>
@@ -18693,7 +18824,7 @@
                   <pic:spPr>
                     <a:xfrm>
                       <a:off x="0" y="0"/>
-                      <a:ext cx="5972175" cy="3989705"/>
+                      <a:ext cx="5972175" cy="4408170"/>
                     </a:xfrm>
                     <a:prstGeom prst="rect">
                       <a:avLst/>
@@ -18746,10 +18877,10 @@
         </w:rPr>
         <w:lastRenderedPageBreak/>
         <w:drawing>
-          <wp:inline distT="0" distB="0" distL="0" distR="0" wp14:anchorId="5FA70DB2" wp14:editId="4EE97C6E">
-            <wp:extent cx="5972175" cy="3982720"/>
+          <wp:inline distT="0" distB="0" distL="0" distR="0" wp14:anchorId="063D4C31" wp14:editId="4DFF1FD9">
+            <wp:extent cx="5972175" cy="4306570"/>
             <wp:effectExtent l="0" t="0" r="9525" b="0"/>
-            <wp:docPr id="1053563117" name="Hình ảnh 1"/>
+            <wp:docPr id="1209844202" name="Hình ảnh 1"/>
             <wp:cNvGraphicFramePr>
               <a:graphicFrameLocks xmlns:a="http://schemas.openxmlformats.org/drawingml/2006/main" noChangeAspect="1"/>
             </wp:cNvGraphicFramePr>
@@ -18757,7 +18888,7 @@
               <a:graphicData uri="http://schemas.openxmlformats.org/drawingml/2006/picture">
                 <pic:pic xmlns:pic="http://schemas.openxmlformats.org/drawingml/2006/picture">
                   <pic:nvPicPr>
-                    <pic:cNvPr id="1053563117" name=""/>
+                    <pic:cNvPr id="1209844202" name=""/>
                     <pic:cNvPicPr/>
                   </pic:nvPicPr>
                   <pic:blipFill>
@@ -18769,7 +18900,7 @@
                   <pic:spPr>
                     <a:xfrm>
                       <a:off x="0" y="0"/>
-                      <a:ext cx="5972175" cy="3982720"/>
+                      <a:ext cx="5972175" cy="4306570"/>
                     </a:xfrm>
                     <a:prstGeom prst="rect">
                       <a:avLst/>
@@ -18806,7 +18937,7 @@
       <w:pPr>
         <w:pStyle w:val="u2"/>
       </w:pPr>
-      <w:bookmarkStart w:id="44" w:name="_Toc225618074"/>
+      <w:bookmarkStart w:id="44" w:name="_Toc226222102"/>
       <w:r>
         <w:t>4.7. Nghiệp vụ Lập hóa đơn (POS) &amp; Xử lý Đa luồng (Multi-threading)</w:t>
       </w:r>
@@ -18908,10 +19039,10 @@
         </w:rPr>
         <w:lastRenderedPageBreak/>
         <w:drawing>
-          <wp:inline distT="0" distB="0" distL="0" distR="0" wp14:anchorId="750C6BD5" wp14:editId="2F19B7B1">
-            <wp:extent cx="5972175" cy="3957320"/>
-            <wp:effectExtent l="0" t="0" r="9525" b="5080"/>
-            <wp:docPr id="356828406" name="Hình ảnh 1"/>
+          <wp:inline distT="0" distB="0" distL="0" distR="0" wp14:anchorId="0627617C" wp14:editId="02519BD3">
+            <wp:extent cx="5972175" cy="4507865"/>
+            <wp:effectExtent l="0" t="0" r="9525" b="6985"/>
+            <wp:docPr id="537436021" name="Hình ảnh 1"/>
             <wp:cNvGraphicFramePr>
               <a:graphicFrameLocks xmlns:a="http://schemas.openxmlformats.org/drawingml/2006/main" noChangeAspect="1"/>
             </wp:cNvGraphicFramePr>
@@ -18919,7 +19050,7 @@
               <a:graphicData uri="http://schemas.openxmlformats.org/drawingml/2006/picture">
                 <pic:pic xmlns:pic="http://schemas.openxmlformats.org/drawingml/2006/picture">
                   <pic:nvPicPr>
-                    <pic:cNvPr id="356828406" name=""/>
+                    <pic:cNvPr id="537436021" name=""/>
                     <pic:cNvPicPr/>
                   </pic:nvPicPr>
                   <pic:blipFill>
@@ -18931,7 +19062,7 @@
                   <pic:spPr>
                     <a:xfrm>
                       <a:off x="0" y="0"/>
-                      <a:ext cx="5972175" cy="3957320"/>
+                      <a:ext cx="5972175" cy="4507865"/>
                     </a:xfrm>
                     <a:prstGeom prst="rect">
                       <a:avLst/>
@@ -19008,10 +19139,10 @@
         </w:rPr>
         <w:lastRenderedPageBreak/>
         <w:drawing>
-          <wp:inline distT="0" distB="0" distL="0" distR="0" wp14:anchorId="7251C663" wp14:editId="600878D6">
-            <wp:extent cx="5972175" cy="3820160"/>
-            <wp:effectExtent l="0" t="0" r="9525" b="8890"/>
-            <wp:docPr id="129042073" name="Hình ảnh 1"/>
+          <wp:inline distT="0" distB="0" distL="0" distR="0" wp14:anchorId="7808A2AC" wp14:editId="75236672">
+            <wp:extent cx="5972175" cy="3990975"/>
+            <wp:effectExtent l="0" t="0" r="9525" b="9525"/>
+            <wp:docPr id="548178281" name="Hình ảnh 1"/>
             <wp:cNvGraphicFramePr>
               <a:graphicFrameLocks xmlns:a="http://schemas.openxmlformats.org/drawingml/2006/main" noChangeAspect="1"/>
             </wp:cNvGraphicFramePr>
@@ -19019,7 +19150,7 @@
               <a:graphicData uri="http://schemas.openxmlformats.org/drawingml/2006/picture">
                 <pic:pic xmlns:pic="http://schemas.openxmlformats.org/drawingml/2006/picture">
                   <pic:nvPicPr>
-                    <pic:cNvPr id="129042073" name=""/>
+                    <pic:cNvPr id="548178281" name=""/>
                     <pic:cNvPicPr/>
                   </pic:nvPicPr>
                   <pic:blipFill>
@@ -19031,7 +19162,7 @@
                   <pic:spPr>
                     <a:xfrm>
                       <a:off x="0" y="0"/>
-                      <a:ext cx="5972175" cy="3820160"/>
+                      <a:ext cx="5972175" cy="3990975"/>
                     </a:xfrm>
                     <a:prstGeom prst="rect">
                       <a:avLst/>
@@ -19106,11 +19237,12 @@
           <w:szCs w:val="26"/>
           <w:lang w:val="en-US"/>
         </w:rPr>
+        <w:lastRenderedPageBreak/>
         <w:drawing>
-          <wp:inline distT="0" distB="0" distL="0" distR="0" wp14:anchorId="1421C025" wp14:editId="6DD50A61">
-            <wp:extent cx="4058216" cy="2114845"/>
-            <wp:effectExtent l="0" t="0" r="0" b="0"/>
-            <wp:docPr id="327394472" name="Hình ảnh 1"/>
+          <wp:inline distT="0" distB="0" distL="0" distR="0" wp14:anchorId="6248246F" wp14:editId="22A9B75E">
+            <wp:extent cx="5972175" cy="3631565"/>
+            <wp:effectExtent l="0" t="0" r="9525" b="6985"/>
+            <wp:docPr id="1507993446" name="Hình ảnh 1"/>
             <wp:cNvGraphicFramePr>
               <a:graphicFrameLocks xmlns:a="http://schemas.openxmlformats.org/drawingml/2006/main" noChangeAspect="1"/>
             </wp:cNvGraphicFramePr>
@@ -19118,7 +19250,7 @@
               <a:graphicData uri="http://schemas.openxmlformats.org/drawingml/2006/picture">
                 <pic:pic xmlns:pic="http://schemas.openxmlformats.org/drawingml/2006/picture">
                   <pic:nvPicPr>
-                    <pic:cNvPr id="327394472" name=""/>
+                    <pic:cNvPr id="1507993446" name=""/>
                     <pic:cNvPicPr/>
                   </pic:nvPicPr>
                   <pic:blipFill>
@@ -19130,7 +19262,7 @@
                   <pic:spPr>
                     <a:xfrm>
                       <a:off x="0" y="0"/>
-                      <a:ext cx="4058216" cy="2114845"/>
+                      <a:ext cx="5972175" cy="3631565"/>
                     </a:xfrm>
                     <a:prstGeom prst="rect">
                       <a:avLst/>
@@ -19181,12 +19313,11 @@
           <w:szCs w:val="26"/>
           <w:lang w:val="en-US"/>
         </w:rPr>
-        <w:lastRenderedPageBreak/>
         <w:drawing>
-          <wp:inline distT="0" distB="0" distL="0" distR="0" wp14:anchorId="4ED14F95" wp14:editId="76ABA0C2">
-            <wp:extent cx="5972175" cy="3486785"/>
-            <wp:effectExtent l="0" t="0" r="9525" b="0"/>
-            <wp:docPr id="38389063" name="Hình ảnh 1"/>
+          <wp:inline distT="0" distB="0" distL="0" distR="0" wp14:anchorId="7957AA7D" wp14:editId="05AEB41F">
+            <wp:extent cx="5972175" cy="3764280"/>
+            <wp:effectExtent l="0" t="0" r="9525" b="7620"/>
+            <wp:docPr id="1963336941" name="Hình ảnh 1"/>
             <wp:cNvGraphicFramePr>
               <a:graphicFrameLocks xmlns:a="http://schemas.openxmlformats.org/drawingml/2006/main" noChangeAspect="1"/>
             </wp:cNvGraphicFramePr>
@@ -19194,7 +19325,7 @@
               <a:graphicData uri="http://schemas.openxmlformats.org/drawingml/2006/picture">
                 <pic:pic xmlns:pic="http://schemas.openxmlformats.org/drawingml/2006/picture">
                   <pic:nvPicPr>
-                    <pic:cNvPr id="38389063" name=""/>
+                    <pic:cNvPr id="1963336941" name=""/>
                     <pic:cNvPicPr/>
                   </pic:nvPicPr>
                   <pic:blipFill>
@@ -19206,7 +19337,7 @@
                   <pic:spPr>
                     <a:xfrm>
                       <a:off x="0" y="0"/>
-                      <a:ext cx="5972175" cy="3486785"/>
+                      <a:ext cx="5972175" cy="3764280"/>
                     </a:xfrm>
                     <a:prstGeom prst="rect">
                       <a:avLst/>
@@ -19257,11 +19388,12 @@
           <w:szCs w:val="26"/>
           <w:lang w:val="en-US"/>
         </w:rPr>
+        <w:lastRenderedPageBreak/>
         <w:drawing>
-          <wp:inline distT="0" distB="0" distL="0" distR="0" wp14:anchorId="0E386ECD" wp14:editId="78AC2EFC">
-            <wp:extent cx="5972175" cy="2877820"/>
+          <wp:inline distT="0" distB="0" distL="0" distR="0" wp14:anchorId="0DD9AE9A" wp14:editId="369A1280">
+            <wp:extent cx="5972175" cy="5894705"/>
             <wp:effectExtent l="0" t="0" r="9525" b="0"/>
-            <wp:docPr id="1037915193" name="Hình ảnh 1"/>
+            <wp:docPr id="154934205" name="Hình ảnh 1"/>
             <wp:cNvGraphicFramePr>
               <a:graphicFrameLocks xmlns:a="http://schemas.openxmlformats.org/drawingml/2006/main" noChangeAspect="1"/>
             </wp:cNvGraphicFramePr>
@@ -19269,7 +19401,7 @@
               <a:graphicData uri="http://schemas.openxmlformats.org/drawingml/2006/picture">
                 <pic:pic xmlns:pic="http://schemas.openxmlformats.org/drawingml/2006/picture">
                   <pic:nvPicPr>
-                    <pic:cNvPr id="1037915193" name=""/>
+                    <pic:cNvPr id="154934205" name=""/>
                     <pic:cNvPicPr/>
                   </pic:nvPicPr>
                   <pic:blipFill>
@@ -19281,7 +19413,7 @@
                   <pic:spPr>
                     <a:xfrm>
                       <a:off x="0" y="0"/>
-                      <a:ext cx="5972175" cy="2877820"/>
+                      <a:ext cx="5972175" cy="5894705"/>
                     </a:xfrm>
                     <a:prstGeom prst="rect">
                       <a:avLst/>
@@ -19329,6 +19461,8 @@
       </w:pPr>
       <w:r>
         <w:rPr>
+          <w:b/>
+          <w:bCs/>
           <w:noProof/>
           <w:sz w:val="26"/>
           <w:szCs w:val="26"/>
@@ -19336,10 +19470,10 @@
         </w:rPr>
         <w:lastRenderedPageBreak/>
         <w:drawing>
-          <wp:inline distT="0" distB="0" distL="0" distR="0" wp14:anchorId="129D20D1" wp14:editId="70D4CED0">
-            <wp:extent cx="5972175" cy="3851910"/>
-            <wp:effectExtent l="0" t="0" r="9525" b="0"/>
-            <wp:docPr id="2141579784" name="Hình ảnh 1"/>
+          <wp:inline distT="0" distB="0" distL="0" distR="0" wp14:anchorId="50AAE305" wp14:editId="0D5C19E9">
+            <wp:extent cx="5972175" cy="4150995"/>
+            <wp:effectExtent l="0" t="0" r="9525" b="1905"/>
+            <wp:docPr id="1449256319" name="Hình ảnh 1"/>
             <wp:cNvGraphicFramePr>
               <a:graphicFrameLocks xmlns:a="http://schemas.openxmlformats.org/drawingml/2006/main" noChangeAspect="1"/>
             </wp:cNvGraphicFramePr>
@@ -19347,7 +19481,7 @@
               <a:graphicData uri="http://schemas.openxmlformats.org/drawingml/2006/picture">
                 <pic:pic xmlns:pic="http://schemas.openxmlformats.org/drawingml/2006/picture">
                   <pic:nvPicPr>
-                    <pic:cNvPr id="2141579784" name=""/>
+                    <pic:cNvPr id="1449256319" name=""/>
                     <pic:cNvPicPr/>
                   </pic:nvPicPr>
                   <pic:blipFill>
@@ -19359,7 +19493,7 @@
                   <pic:spPr>
                     <a:xfrm>
                       <a:off x="0" y="0"/>
-                      <a:ext cx="5972175" cy="3851910"/>
+                      <a:ext cx="5972175" cy="4150995"/>
                     </a:xfrm>
                     <a:prstGeom prst="rect">
                       <a:avLst/>
@@ -19396,7 +19530,7 @@
       <w:pPr>
         <w:pStyle w:val="u2"/>
       </w:pPr>
-      <w:bookmarkStart w:id="45" w:name="_Toc225618075"/>
+      <w:bookmarkStart w:id="45" w:name="_Toc226222103"/>
       <w:r>
         <w:t xml:space="preserve">4.8 </w:t>
       </w:r>
@@ -19465,10 +19599,10 @@
         </w:rPr>
         <w:lastRenderedPageBreak/>
         <w:drawing>
-          <wp:inline distT="0" distB="0" distL="0" distR="0" wp14:anchorId="3BB9889C" wp14:editId="557C4BAF">
-            <wp:extent cx="5972175" cy="3999865"/>
-            <wp:effectExtent l="0" t="0" r="9525" b="635"/>
-            <wp:docPr id="1355991608" name="Hình ảnh 1"/>
+          <wp:inline distT="0" distB="0" distL="0" distR="0" wp14:anchorId="48AF92B8" wp14:editId="1305FD4C">
+            <wp:extent cx="5972175" cy="4078605"/>
+            <wp:effectExtent l="0" t="0" r="9525" b="0"/>
+            <wp:docPr id="1612992910" name="Hình ảnh 1"/>
             <wp:cNvGraphicFramePr>
               <a:graphicFrameLocks xmlns:a="http://schemas.openxmlformats.org/drawingml/2006/main" noChangeAspect="1"/>
             </wp:cNvGraphicFramePr>
@@ -19476,7 +19610,7 @@
               <a:graphicData uri="http://schemas.openxmlformats.org/drawingml/2006/picture">
                 <pic:pic xmlns:pic="http://schemas.openxmlformats.org/drawingml/2006/picture">
                   <pic:nvPicPr>
-                    <pic:cNvPr id="1355991608" name=""/>
+                    <pic:cNvPr id="1612992910" name=""/>
                     <pic:cNvPicPr/>
                   </pic:nvPicPr>
                   <pic:blipFill>
@@ -19488,7 +19622,7 @@
                   <pic:spPr>
                     <a:xfrm>
                       <a:off x="0" y="0"/>
-                      <a:ext cx="5972175" cy="3999865"/>
+                      <a:ext cx="5972175" cy="4078605"/>
                     </a:xfrm>
                     <a:prstGeom prst="rect">
                       <a:avLst/>
@@ -19540,10 +19674,10 @@
           <w:lang w:val="en-US"/>
         </w:rPr>
         <w:drawing>
-          <wp:inline distT="0" distB="0" distL="0" distR="0" wp14:anchorId="7161E272" wp14:editId="7A72EC13">
-            <wp:extent cx="5972175" cy="3899535"/>
-            <wp:effectExtent l="0" t="0" r="9525" b="5715"/>
-            <wp:docPr id="1150686287" name="Hình ảnh 1"/>
+          <wp:inline distT="0" distB="0" distL="0" distR="0" wp14:anchorId="64CF2942" wp14:editId="2CD1C311">
+            <wp:extent cx="5972175" cy="3990975"/>
+            <wp:effectExtent l="0" t="0" r="9525" b="9525"/>
+            <wp:docPr id="1427397632" name="Hình ảnh 1"/>
             <wp:cNvGraphicFramePr>
               <a:graphicFrameLocks xmlns:a="http://schemas.openxmlformats.org/drawingml/2006/main" noChangeAspect="1"/>
             </wp:cNvGraphicFramePr>
@@ -19551,7 +19685,7 @@
               <a:graphicData uri="http://schemas.openxmlformats.org/drawingml/2006/picture">
                 <pic:pic xmlns:pic="http://schemas.openxmlformats.org/drawingml/2006/picture">
                   <pic:nvPicPr>
-                    <pic:cNvPr id="1150686287" name=""/>
+                    <pic:cNvPr id="1427397632" name=""/>
                     <pic:cNvPicPr/>
                   </pic:nvPicPr>
                   <pic:blipFill>
@@ -19563,7 +19697,7 @@
                   <pic:spPr>
                     <a:xfrm>
                       <a:off x="0" y="0"/>
-                      <a:ext cx="5972175" cy="3899535"/>
+                      <a:ext cx="5972175" cy="3990975"/>
                     </a:xfrm>
                     <a:prstGeom prst="rect">
                       <a:avLst/>
@@ -19601,7 +19735,7 @@
       <w:pPr>
         <w:pStyle w:val="u2"/>
       </w:pPr>
-      <w:bookmarkStart w:id="46" w:name="_Toc225618076"/>
+      <w:bookmarkStart w:id="46" w:name="_Toc226222104"/>
       <w:r>
         <w:t>4.9 Báo cáo Thống kê chuyên sâu (Statistics)</w:t>
       </w:r>
@@ -19627,11 +19761,32 @@
       <w:r>
         <w:rPr>
           <w:rFonts w:ascii="Times New Roman" w:hAnsi="Times New Roman" w:cs="Times New Roman"/>
+          <w:b/>
           <w:bCs/>
           <w:sz w:val="26"/>
           <w:szCs w:val="26"/>
-        </w:rPr>
-        <w:t>Quyền truy cập: Chức năng này được bảo mật tuyệt đối, chỉ dành cho Admin.</w:t>
+          <w:lang w:val="vi"/>
+        </w:rPr>
+        <w:t>Quyền truy cập:</w:t>
+      </w:r>
+      <w:r>
+        <w:rPr>
+          <w:rFonts w:ascii="Times New Roman" w:hAnsi="Times New Roman" w:cs="Times New Roman"/>
+          <w:bCs/>
+          <w:sz w:val="26"/>
+          <w:szCs w:val="26"/>
+          <w:lang w:val="vi"/>
+        </w:rPr>
+        <w:t> </w:t>
+      </w:r>
+      <w:r>
+        <w:rPr>
+          <w:rFonts w:ascii="Times New Roman" w:hAnsi="Times New Roman" w:cs="Times New Roman"/>
+          <w:bCs/>
+          <w:sz w:val="26"/>
+          <w:szCs w:val="26"/>
+        </w:rPr>
+        <w:t>Chỉ có admin mới thấy chức năng này</w:t>
       </w:r>
     </w:p>
     <w:p>
@@ -19654,11 +19809,23 @@
       <w:r>
         <w:rPr>
           <w:rFonts w:ascii="Times New Roman" w:hAnsi="Times New Roman" w:cs="Times New Roman"/>
+          <w:b/>
           <w:bCs/>
           <w:sz w:val="26"/>
           <w:szCs w:val="26"/>
-        </w:rPr>
-        <w:t>Chức năng của Admin: Phục vụ công tác kế toán. Admin sử dụng biểu đồ trực quan JFreeChart để theo dõi dòng tiền qua các tháng và định vị Top 10 sản phẩm bán chạy nhất. Cung cấp công cụ trực xuất toàn bộ kết quả thống kê ra định dạng file PDF để làm báo cáo kinh doanh chính thức gửi ban giám đốc.</w:t>
+          <w:lang w:val="vi"/>
+        </w:rPr>
+        <w:t>Chức năng của Admin:</w:t>
+      </w:r>
+      <w:r>
+        <w:rPr>
+          <w:rFonts w:ascii="Times New Roman" w:hAnsi="Times New Roman" w:cs="Times New Roman"/>
+          <w:bCs/>
+          <w:sz w:val="26"/>
+          <w:szCs w:val="26"/>
+          <w:lang w:val="vi"/>
+        </w:rPr>
+        <w:t> Phục vụ đắc lực cho công tác điều hành và kế toán. Admin có toàn quyền sử dụng biểu đồ trực quan JFreeChart để phân tích chuyên sâu dòng tiền qua các tháng và định vị Top 10 sản phẩm bán chạy nhất. Hệ thống cung cấp công cụ trích xuất toàn bộ kết quả thống kê ra định dạng file PDF, hỗ trợ tạo lập các báo cáo kinh doanh chính thức gửi ban giám đốc</w:t>
       </w:r>
     </w:p>
     <w:p>
@@ -19682,10 +19849,10 @@
           <w:lang w:val="en-US"/>
         </w:rPr>
         <w:drawing>
-          <wp:inline distT="0" distB="0" distL="0" distR="0" wp14:anchorId="098B2353" wp14:editId="41380582">
-            <wp:extent cx="5972175" cy="3992245"/>
-            <wp:effectExtent l="0" t="0" r="9525" b="8255"/>
-            <wp:docPr id="1847473201" name="Hình ảnh 1"/>
+          <wp:inline distT="0" distB="0" distL="0" distR="0" wp14:anchorId="2E07F734" wp14:editId="59693E5A">
+            <wp:extent cx="5380551" cy="4030980"/>
+            <wp:effectExtent l="0" t="0" r="0" b="7620"/>
+            <wp:docPr id="643038911" name="Hình ảnh 1"/>
             <wp:cNvGraphicFramePr>
               <a:graphicFrameLocks xmlns:a="http://schemas.openxmlformats.org/drawingml/2006/main" noChangeAspect="1"/>
             </wp:cNvGraphicFramePr>
@@ -19693,7 +19860,7 @@
               <a:graphicData uri="http://schemas.openxmlformats.org/drawingml/2006/picture">
                 <pic:pic xmlns:pic="http://schemas.openxmlformats.org/drawingml/2006/picture">
                   <pic:nvPicPr>
-                    <pic:cNvPr id="1847473201" name=""/>
+                    <pic:cNvPr id="643038911" name=""/>
                     <pic:cNvPicPr/>
                   </pic:nvPicPr>
                   <pic:blipFill>
@@ -19705,7 +19872,7 @@
                   <pic:spPr>
                     <a:xfrm>
                       <a:off x="0" y="0"/>
-                      <a:ext cx="5972175" cy="3992245"/>
+                      <a:ext cx="5388654" cy="4037051"/>
                     </a:xfrm>
                     <a:prstGeom prst="rect">
                       <a:avLst/>
@@ -19806,7 +19973,7 @@
       <w:pPr>
         <w:pStyle w:val="u2"/>
       </w:pPr>
-      <w:bookmarkStart w:id="47" w:name="_Toc225618077"/>
+      <w:bookmarkStart w:id="47" w:name="_Toc226222105"/>
       <w:r>
         <w:lastRenderedPageBreak/>
         <w:t>4.10 Quản lý Nhân sự và Phân quyền (Staff Management)</w:t>
@@ -19899,15 +20066,16 @@
       </w:pPr>
       <w:r>
         <w:rPr>
+          <w:noProof/>
           <w:sz w:val="26"/>
           <w:szCs w:val="26"/>
           <w:lang w:val="en-US"/>
         </w:rPr>
         <w:drawing>
-          <wp:inline distT="0" distB="0" distL="0" distR="0" wp14:anchorId="6B842BE5" wp14:editId="3DA773E9">
-            <wp:extent cx="5972175" cy="3941445"/>
-            <wp:effectExtent l="0" t="0" r="9525" b="1905"/>
-            <wp:docPr id="1080265609" name="Hình ảnh 1"/>
+          <wp:inline distT="0" distB="0" distL="0" distR="0" wp14:anchorId="05F97648" wp14:editId="2280C9AB">
+            <wp:extent cx="5972175" cy="4419600"/>
+            <wp:effectExtent l="0" t="0" r="9525" b="0"/>
+            <wp:docPr id="736375911" name="Hình ảnh 1"/>
             <wp:cNvGraphicFramePr>
               <a:graphicFrameLocks xmlns:a="http://schemas.openxmlformats.org/drawingml/2006/main" noChangeAspect="1"/>
             </wp:cNvGraphicFramePr>
@@ -19915,7 +20083,7 @@
               <a:graphicData uri="http://schemas.openxmlformats.org/drawingml/2006/picture">
                 <pic:pic xmlns:pic="http://schemas.openxmlformats.org/drawingml/2006/picture">
                   <pic:nvPicPr>
-                    <pic:cNvPr id="1080265609" name=""/>
+                    <pic:cNvPr id="736375911" name=""/>
                     <pic:cNvPicPr/>
                   </pic:nvPicPr>
                   <pic:blipFill>
@@ -19927,7 +20095,7 @@
                   <pic:spPr>
                     <a:xfrm>
                       <a:off x="0" y="0"/>
-                      <a:ext cx="5972175" cy="3941445"/>
+                      <a:ext cx="5972175" cy="4419600"/>
                     </a:xfrm>
                     <a:prstGeom prst="rect">
                       <a:avLst/>
@@ -19966,7 +20134,7 @@
       <w:pPr>
         <w:pStyle w:val="u2"/>
       </w:pPr>
-      <w:bookmarkStart w:id="48" w:name="_Toc225618078"/>
+      <w:bookmarkStart w:id="48" w:name="_Toc226222106"/>
       <w:r>
         <w:lastRenderedPageBreak/>
         <w:t xml:space="preserve">4.11 </w:t>
@@ -20074,10 +20242,10 @@
           <w:szCs w:val="26"/>
         </w:rPr>
         <w:drawing>
-          <wp:inline distT="0" distB="0" distL="0" distR="0" wp14:anchorId="5FE56FF1" wp14:editId="363AF37A">
-            <wp:extent cx="5972175" cy="3480435"/>
-            <wp:effectExtent l="0" t="0" r="9525" b="5715"/>
-            <wp:docPr id="1330985178" name="Hình ảnh 1"/>
+          <wp:inline distT="0" distB="0" distL="0" distR="0" wp14:anchorId="57A46970" wp14:editId="6AF7DFA2">
+            <wp:extent cx="5972175" cy="4159885"/>
+            <wp:effectExtent l="0" t="0" r="9525" b="0"/>
+            <wp:docPr id="1095559912" name="Hình ảnh 1"/>
             <wp:cNvGraphicFramePr>
               <a:graphicFrameLocks xmlns:a="http://schemas.openxmlformats.org/drawingml/2006/main" noChangeAspect="1"/>
             </wp:cNvGraphicFramePr>
@@ -20085,7 +20253,7 @@
               <a:graphicData uri="http://schemas.openxmlformats.org/drawingml/2006/picture">
                 <pic:pic xmlns:pic="http://schemas.openxmlformats.org/drawingml/2006/picture">
                   <pic:nvPicPr>
-                    <pic:cNvPr id="1330985178" name=""/>
+                    <pic:cNvPr id="1095559912" name=""/>
                     <pic:cNvPicPr/>
                   </pic:nvPicPr>
                   <pic:blipFill>
@@ -20097,7 +20265,7 @@
                   <pic:spPr>
                     <a:xfrm>
                       <a:off x="0" y="0"/>
-                      <a:ext cx="5972175" cy="3480435"/>
+                      <a:ext cx="5972175" cy="4159885"/>
                     </a:xfrm>
                     <a:prstGeom prst="rect">
                       <a:avLst/>
@@ -20209,7 +20377,7 @@
       <w:pPr>
         <w:pStyle w:val="u1"/>
       </w:pPr>
-      <w:bookmarkStart w:id="49" w:name="_Toc225618079"/>
+      <w:bookmarkStart w:id="49" w:name="_Toc226222107"/>
       <w:r>
         <w:lastRenderedPageBreak/>
         <w:t>CHƯƠNG 5: KẾT LUẬN VÀ HƯỚNG PHÁT TRIỂN</w:t>
@@ -20220,7 +20388,7 @@
       <w:pPr>
         <w:pStyle w:val="u2"/>
       </w:pPr>
-      <w:bookmarkStart w:id="50" w:name="_Toc225618080"/>
+      <w:bookmarkStart w:id="50" w:name="_Toc226222108"/>
       <w:r>
         <w:t>5.1. Kết quả đạt được</w:t>
       </w:r>
@@ -20248,7 +20416,7 @@
       <w:pPr>
         <w:pStyle w:val="u2"/>
       </w:pPr>
-      <w:bookmarkStart w:id="51" w:name="_Toc225618081"/>
+      <w:bookmarkStart w:id="51" w:name="_Toc226222109"/>
       <w:r>
         <w:t>5.2. Khó khăn và Hạn chế</w:t>
       </w:r>
@@ -20302,7 +20470,7 @@
       <w:pPr>
         <w:pStyle w:val="u2"/>
       </w:pPr>
-      <w:bookmarkStart w:id="52" w:name="_Toc225618082"/>
+      <w:bookmarkStart w:id="52" w:name="_Toc226222110"/>
       <w:r>
         <w:t>5.3. Hướng phát triển tương lai</w:t>
       </w:r>
@@ -20396,7 +20564,10 @@
     </w:p>
     <w:p>
       <w:pPr>
-        <w:spacing w:line="360" w:lineRule="auto"/>
+        <w:widowControl/>
+        <w:autoSpaceDE/>
+        <w:autoSpaceDN/>
+        <w:spacing w:after="160" w:line="278" w:lineRule="auto"/>
         <w:rPr>
           <w:b/>
           <w:bCs/>
@@ -20405,9 +20576,433 @@
           <w:lang w:val="en-US"/>
         </w:rPr>
       </w:pPr>
+      <w:r>
+        <w:rPr>
+          <w:b/>
+          <w:bCs/>
+          <w:sz w:val="28"/>
+          <w:szCs w:val="28"/>
+          <w:lang w:val="en-US"/>
+        </w:rPr>
+        <w:br w:type="page"/>
+      </w:r>
+    </w:p>
+    <w:p>
+      <w:pPr>
+        <w:pStyle w:val="u1"/>
+      </w:pPr>
+      <w:bookmarkStart w:id="53" w:name="_Toc226222111"/>
+      <w:r>
+        <w:lastRenderedPageBreak/>
+        <w:t>TÀI LIỆU THAM KHẢO</w:t>
+      </w:r>
+      <w:bookmarkEnd w:id="53"/>
+    </w:p>
+    <w:p>
+      <w:pPr>
+        <w:rPr>
+          <w:sz w:val="26"/>
+          <w:szCs w:val="26"/>
+          <w:lang w:val="en-US"/>
+        </w:rPr>
+      </w:pPr>
+      <w:r>
+        <w:rPr>
+          <w:b/>
+          <w:bCs/>
+          <w:lang w:val="en-US"/>
+        </w:rPr>
+        <w:t>[</w:t>
+      </w:r>
+      <w:r>
+        <w:rPr>
+          <w:b/>
+          <w:bCs/>
+          <w:sz w:val="26"/>
+          <w:szCs w:val="26"/>
+          <w:lang w:val="en-US"/>
+        </w:rPr>
+        <w:t>1] Ngôn ngữ lập trình và Nền tảng:</w:t>
+      </w:r>
+    </w:p>
+    <w:p>
+      <w:pPr>
+        <w:numPr>
+          <w:ilvl w:val="0"/>
+          <w:numId w:val="45"/>
+        </w:numPr>
+        <w:rPr>
+          <w:sz w:val="26"/>
+          <w:szCs w:val="26"/>
+          <w:lang w:val="en-US"/>
+        </w:rPr>
+      </w:pPr>
+      <w:r>
+        <w:rPr>
+          <w:sz w:val="26"/>
+          <w:szCs w:val="26"/>
+          <w:lang w:val="en-US"/>
+        </w:rPr>
+        <w:t>Oracle (2023), </w:t>
+      </w:r>
+      <w:r>
+        <w:rPr>
+          <w:i/>
+          <w:iCs/>
+          <w:sz w:val="26"/>
+          <w:szCs w:val="26"/>
+          <w:lang w:val="en-US"/>
+        </w:rPr>
+        <w:t>Java Platform, Standard Edition Documentation (JDK 17/21)</w:t>
+      </w:r>
+      <w:r>
+        <w:rPr>
+          <w:sz w:val="26"/>
+          <w:szCs w:val="26"/>
+          <w:lang w:val="en-US"/>
+        </w:rPr>
+        <w:t>. Truy cập tại: </w:t>
+      </w:r>
+      <w:hyperlink r:id="rId35" w:history="1">
+        <w:r>
+          <w:rPr>
+            <w:rStyle w:val="Siuktni"/>
+            <w:sz w:val="26"/>
+            <w:szCs w:val="26"/>
+            <w:lang w:val="en-US"/>
+          </w:rPr>
+          <w:t>https://docs.oracle.com/en/java/javase/</w:t>
+        </w:r>
+      </w:hyperlink>
+    </w:p>
+    <w:p>
+      <w:pPr>
+        <w:numPr>
+          <w:ilvl w:val="0"/>
+          <w:numId w:val="45"/>
+        </w:numPr>
+        <w:rPr>
+          <w:sz w:val="26"/>
+          <w:szCs w:val="26"/>
+          <w:lang w:val="en-US"/>
+        </w:rPr>
+      </w:pPr>
+      <w:r>
+        <w:rPr>
+          <w:sz w:val="26"/>
+          <w:szCs w:val="26"/>
+          <w:lang w:val="en-US"/>
+        </w:rPr>
+        <w:t>Hệ quản trị cơ sở dữ liệu MySQL, </w:t>
+      </w:r>
+      <w:r>
+        <w:rPr>
+          <w:i/>
+          <w:iCs/>
+          <w:sz w:val="26"/>
+          <w:szCs w:val="26"/>
+          <w:lang w:val="en-US"/>
+        </w:rPr>
+        <w:t>MySQL 8.0 Reference Manual</w:t>
+      </w:r>
+      <w:r>
+        <w:rPr>
+          <w:sz w:val="26"/>
+          <w:szCs w:val="26"/>
+          <w:lang w:val="en-US"/>
+        </w:rPr>
+        <w:t>. Truy cập tại: </w:t>
+      </w:r>
+      <w:hyperlink r:id="rId36" w:history="1">
+        <w:r>
+          <w:rPr>
+            <w:rStyle w:val="Siuktni"/>
+            <w:sz w:val="26"/>
+            <w:szCs w:val="26"/>
+            <w:lang w:val="en-US"/>
+          </w:rPr>
+          <w:t>https://dev.mysql.com/doc/refman/8.0/en/</w:t>
+        </w:r>
+      </w:hyperlink>
+    </w:p>
+    <w:p>
+      <w:pPr>
+        <w:rPr>
+          <w:sz w:val="26"/>
+          <w:szCs w:val="26"/>
+          <w:lang w:val="en-US"/>
+        </w:rPr>
+      </w:pPr>
+      <w:r>
+        <w:rPr>
+          <w:b/>
+          <w:bCs/>
+          <w:sz w:val="26"/>
+          <w:szCs w:val="26"/>
+          <w:lang w:val="en-US"/>
+        </w:rPr>
+        <w:t>[2] Thư viện và Framework đã sử dụng:</w:t>
+      </w:r>
+    </w:p>
+    <w:p>
+      <w:pPr>
+        <w:numPr>
+          <w:ilvl w:val="0"/>
+          <w:numId w:val="46"/>
+        </w:numPr>
+        <w:rPr>
+          <w:sz w:val="26"/>
+          <w:szCs w:val="26"/>
+          <w:lang w:val="en-US"/>
+        </w:rPr>
+      </w:pPr>
+      <w:r>
+        <w:rPr>
+          <w:sz w:val="26"/>
+          <w:szCs w:val="26"/>
+          <w:lang w:val="en-US"/>
+        </w:rPr>
+        <w:t>FormDev Software (2024), </w:t>
+      </w:r>
+      <w:r>
+        <w:rPr>
+          <w:i/>
+          <w:iCs/>
+          <w:sz w:val="26"/>
+          <w:szCs w:val="26"/>
+          <w:lang w:val="en-US"/>
+        </w:rPr>
+        <w:t>FlatLaf - Flat Look and Feel (Giao diện UI cho Java Swing)</w:t>
+      </w:r>
+      <w:r>
+        <w:rPr>
+          <w:sz w:val="26"/>
+          <w:szCs w:val="26"/>
+          <w:lang w:val="en-US"/>
+        </w:rPr>
+        <w:t>. Truy cập tại: </w:t>
+      </w:r>
+      <w:hyperlink r:id="rId37" w:history="1">
+        <w:r>
+          <w:rPr>
+            <w:rStyle w:val="Siuktni"/>
+            <w:sz w:val="26"/>
+            <w:szCs w:val="26"/>
+            <w:lang w:val="en-US"/>
+          </w:rPr>
+          <w:t>https://www.formdev.com/flatlaf/</w:t>
+        </w:r>
+      </w:hyperlink>
+    </w:p>
+    <w:p>
+      <w:pPr>
+        <w:numPr>
+          <w:ilvl w:val="0"/>
+          <w:numId w:val="46"/>
+        </w:numPr>
+        <w:rPr>
+          <w:sz w:val="26"/>
+          <w:szCs w:val="26"/>
+          <w:lang w:val="en-US"/>
+        </w:rPr>
+      </w:pPr>
+      <w:r>
+        <w:rPr>
+          <w:sz w:val="26"/>
+          <w:szCs w:val="26"/>
+          <w:lang w:val="en-US"/>
+        </w:rPr>
+        <w:t>Hibernate (2023), </w:t>
+      </w:r>
+      <w:r>
+        <w:rPr>
+          <w:i/>
+          <w:iCs/>
+          <w:sz w:val="26"/>
+          <w:szCs w:val="26"/>
+          <w:lang w:val="en-US"/>
+        </w:rPr>
+        <w:t>Hibernate ORM Documentation (Xử lý truy vấn CSDL)</w:t>
+      </w:r>
+      <w:r>
+        <w:rPr>
+          <w:sz w:val="26"/>
+          <w:szCs w:val="26"/>
+          <w:lang w:val="en-US"/>
+        </w:rPr>
+        <w:t>. Truy cập tại: </w:t>
+      </w:r>
+      <w:hyperlink r:id="rId38" w:history="1">
+        <w:r>
+          <w:rPr>
+            <w:rStyle w:val="Siuktni"/>
+            <w:sz w:val="26"/>
+            <w:szCs w:val="26"/>
+            <w:lang w:val="en-US"/>
+          </w:rPr>
+          <w:t>https://hibernate.org/orm/documentation/</w:t>
+        </w:r>
+      </w:hyperlink>
+    </w:p>
+    <w:p>
+      <w:pPr>
+        <w:numPr>
+          <w:ilvl w:val="0"/>
+          <w:numId w:val="46"/>
+        </w:numPr>
+        <w:rPr>
+          <w:sz w:val="26"/>
+          <w:szCs w:val="26"/>
+          <w:lang w:val="en-US"/>
+        </w:rPr>
+      </w:pPr>
+      <w:r>
+        <w:rPr>
+          <w:sz w:val="26"/>
+          <w:szCs w:val="26"/>
+          <w:lang w:val="en-US"/>
+        </w:rPr>
+        <w:t>JFree (2023), </w:t>
+      </w:r>
+      <w:r>
+        <w:rPr>
+          <w:i/>
+          <w:iCs/>
+          <w:sz w:val="26"/>
+          <w:szCs w:val="26"/>
+          <w:lang w:val="en-US"/>
+        </w:rPr>
+        <w:t>JFreeChart - Java Chart Library (Vẽ biểu đồ thống kê)</w:t>
+      </w:r>
+      <w:r>
+        <w:rPr>
+          <w:sz w:val="26"/>
+          <w:szCs w:val="26"/>
+          <w:lang w:val="en-US"/>
+        </w:rPr>
+        <w:t>. Truy cập tại: </w:t>
+      </w:r>
+      <w:hyperlink r:id="rId39" w:history="1">
+        <w:r>
+          <w:rPr>
+            <w:rStyle w:val="Siuktni"/>
+            <w:sz w:val="26"/>
+            <w:szCs w:val="26"/>
+            <w:lang w:val="en-US"/>
+          </w:rPr>
+          <w:t>https://www.jfree.org/jfreechart/</w:t>
+        </w:r>
+      </w:hyperlink>
+    </w:p>
+    <w:p>
+      <w:pPr>
+        <w:numPr>
+          <w:ilvl w:val="0"/>
+          <w:numId w:val="46"/>
+        </w:numPr>
+        <w:rPr>
+          <w:sz w:val="26"/>
+          <w:szCs w:val="26"/>
+          <w:lang w:val="en-US"/>
+        </w:rPr>
+      </w:pPr>
+      <w:r>
+        <w:rPr>
+          <w:sz w:val="26"/>
+          <w:szCs w:val="26"/>
+          <w:lang w:val="en-US"/>
+        </w:rPr>
+        <w:t>iText Software, </w:t>
+      </w:r>
+      <w:r>
+        <w:rPr>
+          <w:i/>
+          <w:iCs/>
+          <w:sz w:val="26"/>
+          <w:szCs w:val="26"/>
+          <w:lang w:val="en-US"/>
+        </w:rPr>
+        <w:t>iTextPDF Library (Hỗ trợ xuất hóa đơn PDF)</w:t>
+      </w:r>
+      <w:r>
+        <w:rPr>
+          <w:sz w:val="26"/>
+          <w:szCs w:val="26"/>
+          <w:lang w:val="en-US"/>
+        </w:rPr>
+        <w:t>. Truy cập tại: </w:t>
+      </w:r>
+      <w:hyperlink r:id="rId40" w:history="1">
+        <w:r>
+          <w:rPr>
+            <w:rStyle w:val="Siuktni"/>
+            <w:sz w:val="26"/>
+            <w:szCs w:val="26"/>
+            <w:lang w:val="en-US"/>
+          </w:rPr>
+          <w:t>https://itextpdf.com/</w:t>
+        </w:r>
+      </w:hyperlink>
+    </w:p>
+    <w:p>
+      <w:pPr>
+        <w:numPr>
+          <w:ilvl w:val="0"/>
+          <w:numId w:val="46"/>
+        </w:numPr>
+        <w:rPr>
+          <w:sz w:val="26"/>
+          <w:szCs w:val="26"/>
+          <w:lang w:val="en-US"/>
+        </w:rPr>
+      </w:pPr>
+      <w:r>
+        <w:rPr>
+          <w:sz w:val="26"/>
+          <w:szCs w:val="26"/>
+          <w:lang w:val="en-US"/>
+        </w:rPr>
+        <w:t>Eclipse Foundation, </w:t>
+      </w:r>
+      <w:r>
+        <w:rPr>
+          <w:i/>
+          <w:iCs/>
+          <w:sz w:val="26"/>
+          <w:szCs w:val="26"/>
+          <w:lang w:val="en-US"/>
+        </w:rPr>
+        <w:t>Jakarta Mail / JavaMail API (Hệ thống gửi Email nền)</w:t>
+      </w:r>
+      <w:r>
+        <w:rPr>
+          <w:sz w:val="26"/>
+          <w:szCs w:val="26"/>
+          <w:lang w:val="en-US"/>
+        </w:rPr>
+        <w:t>. Truy cập tại: </w:t>
+      </w:r>
+      <w:hyperlink r:id="rId41" w:history="1">
+        <w:r>
+          <w:rPr>
+            <w:rStyle w:val="Siuktni"/>
+            <w:sz w:val="26"/>
+            <w:szCs w:val="26"/>
+            <w:lang w:val="en-US"/>
+          </w:rPr>
+          <w:t>https://eclipse-ee4j.github.io/mail/</w:t>
+        </w:r>
+      </w:hyperlink>
+    </w:p>
+    <w:p>
+      <w:pPr>
+        <w:rPr>
+          <w:lang w:val="en-US"/>
+        </w:rPr>
+      </w:pPr>
     </w:p>
     <w:sectPr>
-      <w:footerReference w:type="default" r:id="rId35"/>
+      <w:footerReference w:type="default" r:id="rId42"/>
       <w:pgSz w:w="12240" w:h="15840"/>
       <w:pgMar w:top="1134" w:right="1134" w:bottom="1134" w:left="1701" w:header="720" w:footer="720" w:gutter="0"/>
       <w:pgNumType w:start="1"/>
@@ -24017,7 +24612,7 @@
         <w:rFonts w:ascii="Symbol" w:hAnsi="Symbol" w:hint="default"/>
       </w:rPr>
     </w:lvl>
-    <w:lvl w:ilvl="1" w:tplc="04090003" w:tentative="1">
+    <w:lvl w:ilvl="1" w:tplc="04090003">
       <w:start w:val="1"/>
       <w:numFmt w:val="bullet"/>
       <w:lvlText w:val="o"/>
@@ -25086,6 +25681,155 @@
     </w:lvl>
   </w:abstractNum>
   <w:abstractNum w:abstractNumId="34" w15:restartNumberingAfterBreak="0">
+    <w:nsid w:val="58EA53D9"/>
+    <w:multiLevelType w:val="multilevel"/>
+    <w:tmpl w:val="F412EB5C"/>
+    <w:lvl w:ilvl="0">
+      <w:start w:val="1"/>
+      <w:numFmt w:val="bullet"/>
+      <w:lvlText w:val=""/>
+      <w:lvlJc w:val="left"/>
+      <w:pPr>
+        <w:tabs>
+          <w:tab w:val="num" w:pos="720"/>
+        </w:tabs>
+        <w:ind w:left="720" w:hanging="360"/>
+      </w:pPr>
+      <w:rPr>
+        <w:rFonts w:ascii="Symbol" w:hAnsi="Symbol" w:hint="default"/>
+        <w:sz w:val="20"/>
+      </w:rPr>
+    </w:lvl>
+    <w:lvl w:ilvl="1" w:tentative="1">
+      <w:start w:val="1"/>
+      <w:numFmt w:val="bullet"/>
+      <w:lvlText w:val=""/>
+      <w:lvlJc w:val="left"/>
+      <w:pPr>
+        <w:tabs>
+          <w:tab w:val="num" w:pos="1440"/>
+        </w:tabs>
+        <w:ind w:left="1440" w:hanging="360"/>
+      </w:pPr>
+      <w:rPr>
+        <w:rFonts w:ascii="Symbol" w:hAnsi="Symbol" w:hint="default"/>
+        <w:sz w:val="20"/>
+      </w:rPr>
+    </w:lvl>
+    <w:lvl w:ilvl="2" w:tentative="1">
+      <w:start w:val="1"/>
+      <w:numFmt w:val="bullet"/>
+      <w:lvlText w:val=""/>
+      <w:lvlJc w:val="left"/>
+      <w:pPr>
+        <w:tabs>
+          <w:tab w:val="num" w:pos="2160"/>
+        </w:tabs>
+        <w:ind w:left="2160" w:hanging="360"/>
+      </w:pPr>
+      <w:rPr>
+        <w:rFonts w:ascii="Symbol" w:hAnsi="Symbol" w:hint="default"/>
+        <w:sz w:val="20"/>
+      </w:rPr>
+    </w:lvl>
+    <w:lvl w:ilvl="3" w:tentative="1">
+      <w:start w:val="1"/>
+      <w:numFmt w:val="bullet"/>
+      <w:lvlText w:val=""/>
+      <w:lvlJc w:val="left"/>
+      <w:pPr>
+        <w:tabs>
+          <w:tab w:val="num" w:pos="2880"/>
+        </w:tabs>
+        <w:ind w:left="2880" w:hanging="360"/>
+      </w:pPr>
+      <w:rPr>
+        <w:rFonts w:ascii="Symbol" w:hAnsi="Symbol" w:hint="default"/>
+        <w:sz w:val="20"/>
+      </w:rPr>
+    </w:lvl>
+    <w:lvl w:ilvl="4" w:tentative="1">
+      <w:start w:val="1"/>
+      <w:numFmt w:val="bullet"/>
+      <w:lvlText w:val=""/>
+      <w:lvlJc w:val="left"/>
+      <w:pPr>
+        <w:tabs>
+          <w:tab w:val="num" w:pos="3600"/>
+        </w:tabs>
+        <w:ind w:left="3600" w:hanging="360"/>
+      </w:pPr>
+      <w:rPr>
+        <w:rFonts w:ascii="Symbol" w:hAnsi="Symbol" w:hint="default"/>
+        <w:sz w:val="20"/>
+      </w:rPr>
+    </w:lvl>
+    <w:lvl w:ilvl="5" w:tentative="1">
+      <w:start w:val="1"/>
+      <w:numFmt w:val="bullet"/>
+      <w:lvlText w:val=""/>
+      <w:lvlJc w:val="left"/>
+      <w:pPr>
+        <w:tabs>
+          <w:tab w:val="num" w:pos="4320"/>
+        </w:tabs>
+        <w:ind w:left="4320" w:hanging="360"/>
+      </w:pPr>
+      <w:rPr>
+        <w:rFonts w:ascii="Symbol" w:hAnsi="Symbol" w:hint="default"/>
+        <w:sz w:val="20"/>
+      </w:rPr>
+    </w:lvl>
+    <w:lvl w:ilvl="6" w:tentative="1">
+      <w:start w:val="1"/>
+      <w:numFmt w:val="bullet"/>
+      <w:lvlText w:val=""/>
+      <w:lvlJc w:val="left"/>
+      <w:pPr>
+        <w:tabs>
+          <w:tab w:val="num" w:pos="5040"/>
+        </w:tabs>
+        <w:ind w:left="5040" w:hanging="360"/>
+      </w:pPr>
+      <w:rPr>
+        <w:rFonts w:ascii="Symbol" w:hAnsi="Symbol" w:hint="default"/>
+        <w:sz w:val="20"/>
+      </w:rPr>
+    </w:lvl>
+    <w:lvl w:ilvl="7" w:tentative="1">
+      <w:start w:val="1"/>
+      <w:numFmt w:val="bullet"/>
+      <w:lvlText w:val=""/>
+      <w:lvlJc w:val="left"/>
+      <w:pPr>
+        <w:tabs>
+          <w:tab w:val="num" w:pos="5760"/>
+        </w:tabs>
+        <w:ind w:left="5760" w:hanging="360"/>
+      </w:pPr>
+      <w:rPr>
+        <w:rFonts w:ascii="Symbol" w:hAnsi="Symbol" w:hint="default"/>
+        <w:sz w:val="20"/>
+      </w:rPr>
+    </w:lvl>
+    <w:lvl w:ilvl="8" w:tentative="1">
+      <w:start w:val="1"/>
+      <w:numFmt w:val="bullet"/>
+      <w:lvlText w:val=""/>
+      <w:lvlJc w:val="left"/>
+      <w:pPr>
+        <w:tabs>
+          <w:tab w:val="num" w:pos="6480"/>
+        </w:tabs>
+        <w:ind w:left="6480" w:hanging="360"/>
+      </w:pPr>
+      <w:rPr>
+        <w:rFonts w:ascii="Symbol" w:hAnsi="Symbol" w:hint="default"/>
+        <w:sz w:val="20"/>
+      </w:rPr>
+    </w:lvl>
+  </w:abstractNum>
+  <w:abstractNum w:abstractNumId="35" w15:restartNumberingAfterBreak="0">
     <w:nsid w:val="62DF5644"/>
     <w:multiLevelType w:val="multilevel"/>
     <w:tmpl w:val="3064CD10"/>
@@ -25230,7 +25974,7 @@
       </w:rPr>
     </w:lvl>
   </w:abstractNum>
-  <w:abstractNum w:abstractNumId="35" w15:restartNumberingAfterBreak="0">
+  <w:abstractNum w:abstractNumId="36" w15:restartNumberingAfterBreak="0">
     <w:nsid w:val="64B3682F"/>
     <w:multiLevelType w:val="multilevel"/>
     <w:tmpl w:val="E7DEAF06"/>
@@ -25379,7 +26123,7 @@
       </w:rPr>
     </w:lvl>
   </w:abstractNum>
-  <w:abstractNum w:abstractNumId="36" w15:restartNumberingAfterBreak="0">
+  <w:abstractNum w:abstractNumId="37" w15:restartNumberingAfterBreak="0">
     <w:nsid w:val="6FDB6E54"/>
     <w:multiLevelType w:val="multilevel"/>
     <w:tmpl w:val="BE2C25CC"/>
@@ -25528,7 +26272,7 @@
       </w:rPr>
     </w:lvl>
   </w:abstractNum>
-  <w:abstractNum w:abstractNumId="37" w15:restartNumberingAfterBreak="0">
+  <w:abstractNum w:abstractNumId="38" w15:restartNumberingAfterBreak="0">
     <w:nsid w:val="703F6CF2"/>
     <w:multiLevelType w:val="multilevel"/>
     <w:tmpl w:val="8CDEB268"/>
@@ -25641,7 +26385,7 @@
       </w:rPr>
     </w:lvl>
   </w:abstractNum>
-  <w:abstractNum w:abstractNumId="38" w15:restartNumberingAfterBreak="0">
+  <w:abstractNum w:abstractNumId="39" w15:restartNumberingAfterBreak="0">
     <w:nsid w:val="7112157D"/>
     <w:multiLevelType w:val="multilevel"/>
     <w:tmpl w:val="D6423D4C"/>
@@ -25790,7 +26534,7 @@
       </w:rPr>
     </w:lvl>
   </w:abstractNum>
-  <w:abstractNum w:abstractNumId="39" w15:restartNumberingAfterBreak="0">
+  <w:abstractNum w:abstractNumId="40" w15:restartNumberingAfterBreak="0">
     <w:nsid w:val="72D52358"/>
     <w:multiLevelType w:val="hybridMultilevel"/>
     <w:tmpl w:val="35D6CB94"/>
@@ -25903,7 +26647,7 @@
       </w:rPr>
     </w:lvl>
   </w:abstractNum>
-  <w:abstractNum w:abstractNumId="40" w15:restartNumberingAfterBreak="0">
+  <w:abstractNum w:abstractNumId="41" w15:restartNumberingAfterBreak="0">
     <w:nsid w:val="78122D94"/>
     <w:multiLevelType w:val="multilevel"/>
     <w:tmpl w:val="29CE2D9E"/>
@@ -26052,7 +26796,156 @@
       </w:rPr>
     </w:lvl>
   </w:abstractNum>
-  <w:abstractNum w:abstractNumId="41" w15:restartNumberingAfterBreak="0">
+  <w:abstractNum w:abstractNumId="42" w15:restartNumberingAfterBreak="0">
+    <w:nsid w:val="79A86B47"/>
+    <w:multiLevelType w:val="multilevel"/>
+    <w:tmpl w:val="A9906A8C"/>
+    <w:lvl w:ilvl="0">
+      <w:start w:val="1"/>
+      <w:numFmt w:val="bullet"/>
+      <w:lvlText w:val=""/>
+      <w:lvlJc w:val="left"/>
+      <w:pPr>
+        <w:tabs>
+          <w:tab w:val="num" w:pos="720"/>
+        </w:tabs>
+        <w:ind w:left="720" w:hanging="360"/>
+      </w:pPr>
+      <w:rPr>
+        <w:rFonts w:ascii="Symbol" w:hAnsi="Symbol" w:hint="default"/>
+        <w:sz w:val="20"/>
+      </w:rPr>
+    </w:lvl>
+    <w:lvl w:ilvl="1" w:tentative="1">
+      <w:start w:val="1"/>
+      <w:numFmt w:val="bullet"/>
+      <w:lvlText w:val=""/>
+      <w:lvlJc w:val="left"/>
+      <w:pPr>
+        <w:tabs>
+          <w:tab w:val="num" w:pos="1440"/>
+        </w:tabs>
+        <w:ind w:left="1440" w:hanging="360"/>
+      </w:pPr>
+      <w:rPr>
+        <w:rFonts w:ascii="Symbol" w:hAnsi="Symbol" w:hint="default"/>
+        <w:sz w:val="20"/>
+      </w:rPr>
+    </w:lvl>
+    <w:lvl w:ilvl="2" w:tentative="1">
+      <w:start w:val="1"/>
+      <w:numFmt w:val="bullet"/>
+      <w:lvlText w:val=""/>
+      <w:lvlJc w:val="left"/>
+      <w:pPr>
+        <w:tabs>
+          <w:tab w:val="num" w:pos="2160"/>
+        </w:tabs>
+        <w:ind w:left="2160" w:hanging="360"/>
+      </w:pPr>
+      <w:rPr>
+        <w:rFonts w:ascii="Symbol" w:hAnsi="Symbol" w:hint="default"/>
+        <w:sz w:val="20"/>
+      </w:rPr>
+    </w:lvl>
+    <w:lvl w:ilvl="3" w:tentative="1">
+      <w:start w:val="1"/>
+      <w:numFmt w:val="bullet"/>
+      <w:lvlText w:val=""/>
+      <w:lvlJc w:val="left"/>
+      <w:pPr>
+        <w:tabs>
+          <w:tab w:val="num" w:pos="2880"/>
+        </w:tabs>
+        <w:ind w:left="2880" w:hanging="360"/>
+      </w:pPr>
+      <w:rPr>
+        <w:rFonts w:ascii="Symbol" w:hAnsi="Symbol" w:hint="default"/>
+        <w:sz w:val="20"/>
+      </w:rPr>
+    </w:lvl>
+    <w:lvl w:ilvl="4" w:tentative="1">
+      <w:start w:val="1"/>
+      <w:numFmt w:val="bullet"/>
+      <w:lvlText w:val=""/>
+      <w:lvlJc w:val="left"/>
+      <w:pPr>
+        <w:tabs>
+          <w:tab w:val="num" w:pos="3600"/>
+        </w:tabs>
+        <w:ind w:left="3600" w:hanging="360"/>
+      </w:pPr>
+      <w:rPr>
+        <w:rFonts w:ascii="Symbol" w:hAnsi="Symbol" w:hint="default"/>
+        <w:sz w:val="20"/>
+      </w:rPr>
+    </w:lvl>
+    <w:lvl w:ilvl="5" w:tentative="1">
+      <w:start w:val="1"/>
+      <w:numFmt w:val="bullet"/>
+      <w:lvlText w:val=""/>
+      <w:lvlJc w:val="left"/>
+      <w:pPr>
+        <w:tabs>
+          <w:tab w:val="num" w:pos="4320"/>
+        </w:tabs>
+        <w:ind w:left="4320" w:hanging="360"/>
+      </w:pPr>
+      <w:rPr>
+        <w:rFonts w:ascii="Symbol" w:hAnsi="Symbol" w:hint="default"/>
+        <w:sz w:val="20"/>
+      </w:rPr>
+    </w:lvl>
+    <w:lvl w:ilvl="6" w:tentative="1">
+      <w:start w:val="1"/>
+      <w:numFmt w:val="bullet"/>
+      <w:lvlText w:val=""/>
+      <w:lvlJc w:val="left"/>
+      <w:pPr>
+        <w:tabs>
+          <w:tab w:val="num" w:pos="5040"/>
+        </w:tabs>
+        <w:ind w:left="5040" w:hanging="360"/>
+      </w:pPr>
+      <w:rPr>
+        <w:rFonts w:ascii="Symbol" w:hAnsi="Symbol" w:hint="default"/>
+        <w:sz w:val="20"/>
+      </w:rPr>
+    </w:lvl>
+    <w:lvl w:ilvl="7" w:tentative="1">
+      <w:start w:val="1"/>
+      <w:numFmt w:val="bullet"/>
+      <w:lvlText w:val=""/>
+      <w:lvlJc w:val="left"/>
+      <w:pPr>
+        <w:tabs>
+          <w:tab w:val="num" w:pos="5760"/>
+        </w:tabs>
+        <w:ind w:left="5760" w:hanging="360"/>
+      </w:pPr>
+      <w:rPr>
+        <w:rFonts w:ascii="Symbol" w:hAnsi="Symbol" w:hint="default"/>
+        <w:sz w:val="20"/>
+      </w:rPr>
+    </w:lvl>
+    <w:lvl w:ilvl="8" w:tentative="1">
+      <w:start w:val="1"/>
+      <w:numFmt w:val="bullet"/>
+      <w:lvlText w:val=""/>
+      <w:lvlJc w:val="left"/>
+      <w:pPr>
+        <w:tabs>
+          <w:tab w:val="num" w:pos="6480"/>
+        </w:tabs>
+        <w:ind w:left="6480" w:hanging="360"/>
+      </w:pPr>
+      <w:rPr>
+        <w:rFonts w:ascii="Symbol" w:hAnsi="Symbol" w:hint="default"/>
+        <w:sz w:val="20"/>
+      </w:rPr>
+    </w:lvl>
+  </w:abstractNum>
+  <w:abstractNum w:abstractNumId="43" w15:restartNumberingAfterBreak="0">
     <w:nsid w:val="7AA731BA"/>
     <w:multiLevelType w:val="multilevel"/>
     <w:tmpl w:val="76AACCC4"/>
@@ -26201,7 +27094,7 @@
       </w:rPr>
     </w:lvl>
   </w:abstractNum>
-  <w:abstractNum w:abstractNumId="42" w15:restartNumberingAfterBreak="0">
+  <w:abstractNum w:abstractNumId="44" w15:restartNumberingAfterBreak="0">
     <w:nsid w:val="7ABB1B3F"/>
     <w:multiLevelType w:val="hybridMultilevel"/>
     <w:tmpl w:val="FA4A7E22"/>
@@ -26314,7 +27207,7 @@
       </w:rPr>
     </w:lvl>
   </w:abstractNum>
-  <w:abstractNum w:abstractNumId="43" w15:restartNumberingAfterBreak="0">
+  <w:abstractNum w:abstractNumId="45" w15:restartNumberingAfterBreak="0">
     <w:nsid w:val="7E932A51"/>
     <w:multiLevelType w:val="multilevel"/>
     <w:tmpl w:val="1C7C2FAA"/>
@@ -26470,7 +27363,7 @@
     <w:abstractNumId w:val="22"/>
   </w:num>
   <w:num w:numId="3" w16cid:durableId="1774007400">
-    <w:abstractNumId w:val="41"/>
+    <w:abstractNumId w:val="43"/>
   </w:num>
   <w:num w:numId="4" w16cid:durableId="1628469604">
     <w:abstractNumId w:val="24"/>
@@ -26485,13 +27378,13 @@
     <w:abstractNumId w:val="12"/>
   </w:num>
   <w:num w:numId="8" w16cid:durableId="1052266114">
-    <w:abstractNumId w:val="34"/>
+    <w:abstractNumId w:val="35"/>
   </w:num>
   <w:num w:numId="9" w16cid:durableId="1103653249">
     <w:abstractNumId w:val="4"/>
   </w:num>
   <w:num w:numId="10" w16cid:durableId="1522091478">
-    <w:abstractNumId w:val="36"/>
+    <w:abstractNumId w:val="37"/>
   </w:num>
   <w:num w:numId="11" w16cid:durableId="432291040">
     <w:abstractNumId w:val="13"/>
@@ -26509,13 +27402,13 @@
     <w:abstractNumId w:val="25"/>
   </w:num>
   <w:num w:numId="16" w16cid:durableId="949779603">
-    <w:abstractNumId w:val="39"/>
+    <w:abstractNumId w:val="40"/>
   </w:num>
   <w:num w:numId="17" w16cid:durableId="1168404001">
     <w:abstractNumId w:val="17"/>
   </w:num>
   <w:num w:numId="18" w16cid:durableId="573589975">
-    <w:abstractNumId w:val="42"/>
+    <w:abstractNumId w:val="44"/>
   </w:num>
   <w:num w:numId="19" w16cid:durableId="1714696579">
     <w:abstractNumId w:val="11"/>
@@ -26545,19 +27438,19 @@
     <w:abstractNumId w:val="0"/>
   </w:num>
   <w:num w:numId="28" w16cid:durableId="320624004">
-    <w:abstractNumId w:val="38"/>
+    <w:abstractNumId w:val="39"/>
   </w:num>
   <w:num w:numId="29" w16cid:durableId="359624285">
     <w:abstractNumId w:val="20"/>
   </w:num>
   <w:num w:numId="30" w16cid:durableId="253243928">
-    <w:abstractNumId w:val="35"/>
+    <w:abstractNumId w:val="36"/>
   </w:num>
   <w:num w:numId="31" w16cid:durableId="249046610">
-    <w:abstractNumId w:val="43"/>
+    <w:abstractNumId w:val="45"/>
   </w:num>
   <w:num w:numId="32" w16cid:durableId="1119766566">
-    <w:abstractNumId w:val="40"/>
+    <w:abstractNumId w:val="41"/>
   </w:num>
   <w:num w:numId="33" w16cid:durableId="1264414269">
     <w:abstractNumId w:val="9"/>
@@ -26590,10 +27483,16 @@
     <w:abstractNumId w:val="8"/>
   </w:num>
   <w:num w:numId="43" w16cid:durableId="2066953558">
-    <w:abstractNumId w:val="37"/>
+    <w:abstractNumId w:val="38"/>
   </w:num>
   <w:num w:numId="44" w16cid:durableId="1977250552">
     <w:abstractNumId w:val="1"/>
+  </w:num>
+  <w:num w:numId="45" w16cid:durableId="1403218216">
+    <w:abstractNumId w:val="34"/>
+  </w:num>
+  <w:num w:numId="46" w16cid:durableId="1909655618">
+    <w:abstractNumId w:val="42"/>
   </w:num>
 </w:numbering>
 </file>
@@ -27875,6 +28774,18 @@
       <w:u w:val="single"/>
     </w:rPr>
   </w:style>
+  <w:style w:type="character" w:styleId="cpChagiiquyt">
+    <w:name w:val="Unresolved Mention"/>
+    <w:basedOn w:val="Phngmcinhcuaoanvn"/>
+    <w:uiPriority w:val="99"/>
+    <w:semiHidden/>
+    <w:unhideWhenUsed/>
+    <w:rsid w:val="00B371F8"/>
+    <w:rPr>
+      <w:color w:val="605E5C"/>
+      <w:shd w:val="clear" w:color="auto" w:fill="E1DFDD"/>
+    </w:rPr>
+  </w:style>
 </w:styles>
 </file>
 

</xml_diff>